<commit_message>
sync of thesis.docx and .pdf
Signed-off-by: MaxGroshev <groshevmaxim84@yandex.ru>
</commit_message>
<xml_diff>
--- a/conf/tezis_groshev.docx
+++ b/conf/tezis_groshev.docx
@@ -1,6 +1,6 @@
 
 <file path=word/document.xml><?xml version="1.0" encoding="utf-8"?>
-<w:document xmlns:o="urn:schemas-microsoft-com:office:office" xmlns:r="http://schemas.openxmlformats.org/officeDocument/2006/relationships" xmlns:v="urn:schemas-microsoft-com:vml" xmlns:w="http://schemas.openxmlformats.org/wordprocessingml/2006/main" xmlns:w10="urn:schemas-microsoft-com:office:word" xmlns:wp="http://schemas.openxmlformats.org/drawingml/2006/wordprocessingDrawing" xmlns:wps="http://schemas.microsoft.com/office/word/2010/wordprocessingShape" xmlns:wpg="http://schemas.microsoft.com/office/word/2010/wordprocessingGroup" xmlns:mc="http://schemas.openxmlformats.org/markup-compatibility/2006" xmlns:wp14="http://schemas.microsoft.com/office/word/2010/wordprocessingDrawing" xmlns:w14="http://schemas.microsoft.com/office/word/2010/wordml" xmlns:w15="http://schemas.microsoft.com/office/word/2012/wordml" mc:Ignorable="w14 wp14 w15">
+<w:document xmlns:o="urn:schemas-microsoft-com:office:office" xmlns:r="http://schemas.openxmlformats.org/officeDocument/2006/relationships" xmlns:v="urn:schemas-microsoft-com:vml" xmlns:w="http://schemas.openxmlformats.org/wordprocessingml/2006/main" xmlns:w10="urn:schemas-microsoft-com:office:word" xmlns:wp="http://schemas.openxmlformats.org/drawingml/2006/wordprocessingDrawing" xmlns:pic="http://schemas.openxmlformats.org/drawingml/2006/picture" xmlns:wps="http://schemas.microsoft.com/office/word/2010/wordprocessingShape" xmlns:wpg="http://schemas.microsoft.com/office/word/2010/wordprocessingGroup" xmlns:mc="http://schemas.openxmlformats.org/markup-compatibility/2006" xmlns:wp14="http://schemas.microsoft.com/office/word/2010/wordprocessingDrawing" xmlns:w14="http://schemas.microsoft.com/office/word/2010/wordml" xmlns:w15="http://schemas.microsoft.com/office/word/2012/wordml" mc:Ignorable="w14 wp14 w15">
   <w:body>
     <w:p>
       <w:pPr>
@@ -13,7 +13,7 @@
         <w:suppressAutoHyphens w:val="false"/>
         <w:bidi w:val="0"/>
         <w:spacing w:lineRule="auto" w:line="240" w:beforeAutospacing="0" w:before="600" w:afterAutospacing="0" w:after="0"/>
-        <w:ind w:left="0" w:right="0" w:firstLine="567"/>
+        <w:ind w:firstLine="567" w:left="0" w:right="0"/>
         <w:jc w:val="both"/>
         <w:rPr/>
       </w:pPr>
@@ -59,11 +59,6 @@
           <w14:textOutline>
             <w14:noFill/>
           </w14:textOutline>
-          <w14:textFill>
-            <w14:solidFill>
-              <w14:srgbClr w14:val="000000"/>
-            </w14:solidFill>
-          </w14:textFill>
         </w:rPr>
         <w:t>В</w:t>
       </w:r>
@@ -142,22 +137,21 @@
       </w:pPr>
       <w:r>
         <w:rPr>
-          <w:rFonts w:ascii="Times New Roman" w:hAnsi="Times New Roman"/>
-          <w:b w:val="false"/>
-          <w:i w:val="false"/>
-          <w:caps w:val="false"/>
-          <w:smallCaps w:val="false"/>
-          <w:color w:val="000000"/>
-          <w:spacing w:val="0"/>
-          <w:sz w:val="22"/>
-          <w:szCs w:val="22"/>
-          <w:lang w:val="ru-RU"/>
-        </w:rPr>
-        <w:t xml:space="preserve">В настоящее время большой популярностью пользуются языки со статической типизацией. </w:t>
-      </w:r>
-      <w:r>
-        <w:rPr>
-          <w:rFonts w:eastAsia="Arial Unicode MS" w:cs="Arial Unicode MS" w:ascii="Times New Roman" w:hAnsi="Times New Roman"/>
+          <w:b w:val="false"/>
+          <w:i w:val="false"/>
+          <w:caps w:val="false"/>
+          <w:smallCaps w:val="false"/>
+          <w:color w:val="000000"/>
+          <w:spacing w:val="0"/>
+          <w:sz w:val="22"/>
+          <w:szCs w:val="22"/>
+          <w:lang w:val="ru-RU"/>
+        </w:rPr>
+        <w:t xml:space="preserve">В настоящее время большой популярностью пользуются языки </w:t>
+      </w:r>
+      <w:r>
+        <w:rPr>
+          <w:rFonts w:eastAsia="Arial Unicode MS" w:cs="Arial Unicode MS"/>
           <w:b w:val="false"/>
           <w:bCs w:val="false"/>
           <w:i w:val="false"/>
@@ -182,17 +176,26 @@
           <w:shd w:fill="auto" w:val="clear"/>
           <w:vertAlign w:val="baseline"/>
           <w:lang w:val="ru-RU" w:eastAsia="zh-CN" w:bidi="hi-IN"/>
-          <w14:textFill>
-            <w14:solidFill>
-              <w14:srgbClr w14:val="000000"/>
-            </w14:solidFill>
-          </w14:textFill>
-        </w:rPr>
-        <w:t>При этом зачастую возникает потребность в поддержании ряда динамических типов на уровне среды исполнения. Поддержка динамических аспектов не должна приводить к снижению гарантий типовой безопасности или к появлению дополнительных ошибок времени выполнения. Однако существующие платформы, такие как Android Runtime (ART) и Java Virtual Machine (JVM), изначально ориентированы преимущественно на строго статическую модель типов и не предоставляют специализированного набора инструкций, напрямую предназначенного для эффективной и безопасной работы с динамически разрешаемыми типами.</w:t>
-      </w:r>
-      <w:r>
-        <w:rPr>
-          <w:rFonts w:eastAsia="Arial Unicode MS" w:cs="Arial Unicode MS" w:ascii="Times New Roman" w:hAnsi="Times New Roman"/>
+        </w:rPr>
+        <w:t xml:space="preserve">программирования </w:t>
+      </w:r>
+      <w:r>
+        <w:rPr>
+          <w:b w:val="false"/>
+          <w:i w:val="false"/>
+          <w:caps w:val="false"/>
+          <w:smallCaps w:val="false"/>
+          <w:color w:val="000000"/>
+          <w:spacing w:val="0"/>
+          <w:sz w:val="22"/>
+          <w:szCs w:val="22"/>
+          <w:lang w:val="ru-RU"/>
+        </w:rPr>
+        <w:t xml:space="preserve">со статической типизацией. </w:t>
+      </w:r>
+      <w:r>
+        <w:rPr>
+          <w:rFonts w:eastAsia="Arial Unicode MS" w:cs="Arial Unicode MS"/>
           <w:b w:val="false"/>
           <w:bCs w:val="false"/>
           <w:i w:val="false"/>
@@ -216,18 +219,13 @@
           <w:u w:val="none" w:color="000000"/>
           <w:shd w:fill="auto" w:val="clear"/>
           <w:vertAlign w:val="baseline"/>
-          <w:lang w:val="en-US" w:eastAsia="zh-CN" w:bidi="hi-IN"/>
-          <w14:textFill>
-            <w14:solidFill>
-              <w14:srgbClr w14:val="000000"/>
-            </w14:solidFill>
-          </w14:textFill>
-        </w:rPr>
-        <w:t xml:space="preserve"> Разработка </w:t>
-      </w:r>
-      <w:r>
-        <w:rPr>
-          <w:rFonts w:eastAsia="Arial Unicode MS" w:cs="Arial Unicode MS" w:ascii="Times New Roman" w:hAnsi="Times New Roman"/>
+          <w:lang w:val="ru-RU" w:eastAsia="zh-CN" w:bidi="hi-IN"/>
+        </w:rPr>
+        <w:t>При этом зачастую, для повышения выразительности языка, возникает потребность в  динамических типах, а для высокой производительности необходима их поддержка на уровне среды исполнения. Наличие динамики не должно приводить к снижению типовой безопасности или к появлению дополнительных ошибок времени выполнения. Существующие платформы, такие как Android Runtime (ART) и Java Virtual Machine (JVM), изначально ориентированы преимущественно на строго статическую модель типов и не предоставляют специализированного набора инструкций и метаинформации, сохраняемой до момента исполнения, напрямую предназначенной для эффективной и безопасной работы с динамически разрешаемыми типами.</w:t>
+      </w:r>
+      <w:r>
+        <w:rPr>
+          <w:rFonts w:eastAsia="Arial Unicode MS" w:cs="Arial Unicode MS"/>
           <w:b w:val="false"/>
           <w:bCs w:val="false"/>
           <w:i w:val="false"/>
@@ -252,103 +250,30 @@
           <w:shd w:fill="auto" w:val="clear"/>
           <w:vertAlign w:val="baseline"/>
           <w:lang w:val="en-US" w:eastAsia="zh-CN" w:bidi="hi-IN"/>
-          <w14:textFill>
-            <w14:solidFill>
-              <w14:srgbClr w14:val="000000"/>
-            </w14:solidFill>
-          </w14:textFill>
-        </w:rPr>
-        <w:t>алгоритмов</w:t>
-      </w:r>
-      <w:r>
-        <w:rPr>
-          <w:rFonts w:eastAsia="Arial Unicode MS" w:cs="Arial Unicode MS" w:ascii="Times New Roman" w:hAnsi="Times New Roman"/>
-          <w:b w:val="false"/>
-          <w:bCs w:val="false"/>
-          <w:i w:val="false"/>
-          <w:iCs w:val="false"/>
-          <w:caps w:val="false"/>
-          <w:smallCaps w:val="false"/>
-          <w:strike w:val="false"/>
-          <w:dstrike w:val="false"/>
-          <w:outline w:val="false"/>
-          <w:emboss w:val="false"/>
-          <w:imprint w:val="false"/>
-          <w:vanish w:val="false"/>
-          <w:color w:val="000000"/>
-          <w:spacing w:val="0"/>
-          <w:w w:val="100"/>
-          <w:kern w:val="0"/>
-          <w:position w:val="0"/>
-          <w:sz w:val="22"/>
-          <w:sz w:val="22"/>
-          <w:szCs w:val="22"/>
-          <w:u w:val="none" w:color="000000"/>
-          <w:shd w:fill="auto" w:val="clear"/>
-          <w:vertAlign w:val="baseline"/>
-          <w:lang w:val="en-US" w:eastAsia="zh-CN" w:bidi="hi-IN"/>
-          <w14:textFill>
-            <w14:solidFill>
-              <w14:srgbClr w14:val="000000"/>
-            </w14:solidFill>
-          </w14:textFill>
-        </w:rPr>
-        <w:t xml:space="preserve"> верификация подобных инструкций являются целью данной работы.</w:t>
+        </w:rPr>
+        <w:t xml:space="preserve"> Разработка алгоритмов верификация подобных инструкций являются целью данной работы.</w:t>
       </w:r>
     </w:p>
     <w:p>
       <w:pPr>
         <w:pStyle w:val="Normal"/>
         <w:widowControl/>
-        <w:ind w:left="0" w:right="0" w:hanging="0"/>
+        <w:ind w:hanging="0" w:left="0" w:right="0"/>
         <w:rPr>
           <w:rFonts w:ascii="Times New Roman" w:hAnsi="Times New Roman"/>
           <w:b w:val="false"/>
           <w:i w:val="false"/>
-          <w:caps w:val="false"/>
-          <w:smallCaps w:val="false"/>
-          <w:color w:val="000000"/>
-          <w:spacing w:val="0"/>
-          <w:sz w:val="22"/>
-          <w:szCs w:val="22"/>
-        </w:rPr>
-      </w:pPr>
-      <w:r>
-        <w:rPr>
-          <w:rFonts w:ascii="Times New Roman" w:hAnsi="Times New Roman"/>
-          <w:b w:val="false"/>
-          <w:i w:val="false"/>
-          <w:caps w:val="false"/>
-          <w:smallCaps w:val="false"/>
-          <w:color w:val="000000"/>
-          <w:spacing w:val="0"/>
-          <w:sz w:val="22"/>
-          <w:szCs w:val="22"/>
-        </w:rPr>
-        <w:tab/>
-        <w:t>Целевая платформа в своей системе типов поддерживает типы, разрешаемые динамически. К ним относятся union-тип — составной тип данных, позволяющий объекту во время выполнения принимать значение одного из заранее определённых типов, — а также any-тип, допускающий присвоение объекту значения произвольного типа, включая типы, определённые на динамической стороне.</w:t>
-      </w:r>
-    </w:p>
-    <w:p>
-      <w:pPr>
-        <w:pStyle w:val="Normal"/>
-        <w:widowControl/>
-        <w:ind w:left="0" w:right="0" w:hanging="0"/>
-        <w:rPr>
-          <w:rFonts w:ascii="Times New Roman" w:hAnsi="Times New Roman"/>
-          <w:b w:val="false"/>
-          <w:i w:val="false"/>
-          <w:caps w:val="false"/>
-          <w:smallCaps w:val="false"/>
-          <w:color w:val="000000"/>
-          <w:spacing w:val="0"/>
-          <w:sz w:val="22"/>
-          <w:szCs w:val="22"/>
-        </w:rPr>
-      </w:pPr>
-      <w:r>
-        <w:rPr>
-          <w:rFonts w:ascii="Times New Roman" w:hAnsi="Times New Roman"/>
+          <w:i w:val="false"/>
+          <w:caps w:val="false"/>
+          <w:smallCaps w:val="false"/>
+          <w:color w:val="000000"/>
+          <w:spacing w:val="0"/>
+          <w:sz w:val="22"/>
+          <w:szCs w:val="22"/>
+        </w:rPr>
+      </w:pPr>
+      <w:r>
+        <w:rPr>
           <w:b w:val="false"/>
           <w:i w:val="false"/>
           <w:caps w:val="false"/>
@@ -368,22 +293,22 @@
       <w:pPr>
         <w:pStyle w:val="Normal"/>
         <w:widowControl/>
-        <w:ind w:left="0" w:right="0" w:hanging="0"/>
+        <w:ind w:hanging="0" w:left="0" w:right="0"/>
         <w:rPr>
           <w:rFonts w:ascii="Times New Roman" w:hAnsi="Times New Roman"/>
           <w:b w:val="false"/>
           <w:i w:val="false"/>
-          <w:caps w:val="false"/>
-          <w:smallCaps w:val="false"/>
-          <w:color w:val="000000"/>
-          <w:spacing w:val="0"/>
-          <w:sz w:val="22"/>
-          <w:szCs w:val="22"/>
-        </w:rPr>
-      </w:pPr>
-      <w:r>
-        <w:rPr>
-          <w:rFonts w:ascii="Times New Roman" w:hAnsi="Times New Roman"/>
+          <w:i w:val="false"/>
+          <w:caps w:val="false"/>
+          <w:smallCaps w:val="false"/>
+          <w:color w:val="000000"/>
+          <w:spacing w:val="0"/>
+          <w:sz w:val="22"/>
+          <w:szCs w:val="22"/>
+        </w:rPr>
+      </w:pPr>
+      <w:r>
+        <w:rPr>
           <w:b w:val="false"/>
           <w:i w:val="false"/>
           <w:caps w:val="false"/>
@@ -438,6 +363,7 @@
                     <a:prstGeom prst="rect">
                       <a:avLst/>
                     </a:prstGeom>
+                    <a:noFill/>
                   </pic:spPr>
                 </pic:pic>
               </a:graphicData>
@@ -447,7 +373,6 @@
       </w:r>
       <w:r>
         <w:rPr>
-          <w:rFonts w:ascii="Times New Roman" w:hAnsi="Times New Roman"/>
           <w:b w:val="false"/>
           <w:i w:val="false"/>
           <w:caps w:val="false"/>
@@ -465,22 +390,14 @@
       <w:pPr>
         <w:pStyle w:val="Normal"/>
         <w:widowControl/>
-        <w:ind w:left="0" w:right="0" w:hanging="0"/>
-        <w:rPr>
-          <w:lang w:val="ru-RU"/>
-        </w:rPr>
-      </w:pPr>
-      <w:r>
-        <w:rPr>
-          <w:rFonts w:ascii="Times New Roman" w:hAnsi="Times New Roman"/>
-          <w:b w:val="false"/>
-          <w:i w:val="false"/>
-          <w:caps w:val="false"/>
-          <w:smallCaps w:val="false"/>
-          <w:color w:val="000000"/>
-          <w:spacing w:val="0"/>
-          <w:sz w:val="22"/>
-          <w:szCs w:val="22"/>
+        <w:ind w:hanging="0" w:left="0" w:right="0"/>
+        <w:rPr>
+          <w:lang w:val="ru-RU"/>
+        </w:rPr>
+      </w:pPr>
+      <w:r>
+        <w:rPr>
+          <w:lang w:val="ru-RU"/>
         </w:rPr>
       </w:r>
     </w:p>
@@ -488,22 +405,22 @@
       <w:pPr>
         <w:pStyle w:val="Normal"/>
         <w:widowControl/>
-        <w:ind w:left="0" w:right="0" w:hanging="0"/>
+        <w:ind w:hanging="0" w:left="0" w:right="0"/>
         <w:rPr>
           <w:rFonts w:ascii="Times New Roman" w:hAnsi="Times New Roman"/>
           <w:b w:val="false"/>
           <w:i w:val="false"/>
-          <w:caps w:val="false"/>
-          <w:smallCaps w:val="false"/>
-          <w:color w:val="000000"/>
-          <w:spacing w:val="0"/>
-          <w:sz w:val="22"/>
-          <w:szCs w:val="22"/>
-        </w:rPr>
-      </w:pPr>
-      <w:r>
-        <w:rPr>
-          <w:rFonts w:ascii="Times New Roman" w:hAnsi="Times New Roman"/>
+          <w:i w:val="false"/>
+          <w:caps w:val="false"/>
+          <w:smallCaps w:val="false"/>
+          <w:color w:val="000000"/>
+          <w:spacing w:val="0"/>
+          <w:sz w:val="22"/>
+          <w:szCs w:val="22"/>
+        </w:rPr>
+      </w:pPr>
+      <w:r>
+        <w:rPr>
           <w:b w:val="false"/>
           <w:i w:val="false"/>
           <w:caps w:val="false"/>
@@ -523,22 +440,14 @@
       <w:pPr>
         <w:pStyle w:val="Normal"/>
         <w:widowControl/>
-        <w:ind w:left="0" w:right="0" w:hanging="0"/>
-        <w:rPr>
-          <w:lang w:val="ru-RU"/>
-        </w:rPr>
-      </w:pPr>
-      <w:r>
-        <w:rPr>
-          <w:rFonts w:ascii="Times New Roman" w:hAnsi="Times New Roman"/>
-          <w:b w:val="false"/>
-          <w:i w:val="false"/>
-          <w:caps w:val="false"/>
-          <w:smallCaps w:val="false"/>
-          <w:color w:val="000000"/>
-          <w:spacing w:val="0"/>
-          <w:sz w:val="22"/>
-          <w:szCs w:val="22"/>
+        <w:ind w:hanging="0" w:left="0" w:right="0"/>
+        <w:rPr>
+          <w:lang w:val="ru-RU"/>
+        </w:rPr>
+      </w:pPr>
+      <w:r>
+        <w:rPr>
+          <w:lang w:val="ru-RU"/>
         </w:rPr>
       </w:r>
     </w:p>
@@ -546,22 +455,14 @@
       <w:pPr>
         <w:pStyle w:val="Normal"/>
         <w:widowControl/>
-        <w:ind w:left="0" w:right="0" w:hanging="0"/>
-        <w:rPr>
-          <w:lang w:val="ru-RU"/>
-        </w:rPr>
-      </w:pPr>
-      <w:r>
-        <w:rPr>
-          <w:rFonts w:ascii="Times New Roman" w:hAnsi="Times New Roman"/>
-          <w:b w:val="false"/>
-          <w:i w:val="false"/>
-          <w:caps w:val="false"/>
-          <w:smallCaps w:val="false"/>
-          <w:color w:val="000000"/>
-          <w:spacing w:val="0"/>
-          <w:sz w:val="22"/>
-          <w:szCs w:val="22"/>
+        <w:ind w:hanging="0" w:left="0" w:right="0"/>
+        <w:rPr>
+          <w:lang w:val="ru-RU"/>
+        </w:rPr>
+      </w:pPr>
+      <w:r>
+        <w:rPr>
+          <w:lang w:val="ru-RU"/>
         </w:rPr>
       </w:r>
     </w:p>
@@ -569,22 +470,14 @@
       <w:pPr>
         <w:pStyle w:val="Normal"/>
         <w:widowControl/>
-        <w:ind w:left="0" w:right="0" w:hanging="0"/>
-        <w:rPr>
-          <w:lang w:val="ru-RU"/>
-        </w:rPr>
-      </w:pPr>
-      <w:r>
-        <w:rPr>
-          <w:rFonts w:ascii="Times New Roman" w:hAnsi="Times New Roman"/>
-          <w:b w:val="false"/>
-          <w:i w:val="false"/>
-          <w:caps w:val="false"/>
-          <w:smallCaps w:val="false"/>
-          <w:color w:val="000000"/>
-          <w:spacing w:val="0"/>
-          <w:sz w:val="22"/>
-          <w:szCs w:val="22"/>
+        <w:ind w:hanging="0" w:left="0" w:right="0"/>
+        <w:rPr>
+          <w:lang w:val="ru-RU"/>
+        </w:rPr>
+      </w:pPr>
+      <w:r>
+        <w:rPr>
+          <w:lang w:val="ru-RU"/>
         </w:rPr>
       </w:r>
     </w:p>
@@ -592,22 +485,14 @@
       <w:pPr>
         <w:pStyle w:val="Normal"/>
         <w:widowControl/>
-        <w:ind w:left="0" w:right="0" w:hanging="0"/>
-        <w:rPr>
-          <w:lang w:val="ru-RU"/>
-        </w:rPr>
-      </w:pPr>
-      <w:r>
-        <w:rPr>
-          <w:rFonts w:ascii="Times New Roman" w:hAnsi="Times New Roman"/>
-          <w:b w:val="false"/>
-          <w:i w:val="false"/>
-          <w:caps w:val="false"/>
-          <w:smallCaps w:val="false"/>
-          <w:color w:val="000000"/>
-          <w:spacing w:val="0"/>
-          <w:sz w:val="22"/>
-          <w:szCs w:val="22"/>
+        <w:ind w:hanging="0" w:left="0" w:right="0"/>
+        <w:rPr>
+          <w:lang w:val="ru-RU"/>
+        </w:rPr>
+      </w:pPr>
+      <w:r>
+        <w:rPr>
+          <w:lang w:val="ru-RU"/>
         </w:rPr>
       </w:r>
     </w:p>
@@ -615,22 +500,14 @@
       <w:pPr>
         <w:pStyle w:val="Normal"/>
         <w:widowControl/>
-        <w:ind w:left="0" w:right="0" w:hanging="0"/>
-        <w:rPr>
-          <w:lang w:val="ru-RU"/>
-        </w:rPr>
-      </w:pPr>
-      <w:r>
-        <w:rPr>
-          <w:rFonts w:ascii="Times New Roman" w:hAnsi="Times New Roman"/>
-          <w:b w:val="false"/>
-          <w:i w:val="false"/>
-          <w:caps w:val="false"/>
-          <w:smallCaps w:val="false"/>
-          <w:color w:val="000000"/>
-          <w:spacing w:val="0"/>
-          <w:sz w:val="22"/>
-          <w:szCs w:val="22"/>
+        <w:ind w:hanging="0" w:left="0" w:right="0"/>
+        <w:rPr>
+          <w:lang w:val="ru-RU"/>
+        </w:rPr>
+      </w:pPr>
+      <w:r>
+        <w:rPr>
+          <w:lang w:val="ru-RU"/>
         </w:rPr>
       </w:r>
     </w:p>
@@ -638,22 +515,14 @@
       <w:pPr>
         <w:pStyle w:val="Normal"/>
         <w:widowControl/>
-        <w:ind w:left="0" w:right="0" w:hanging="0"/>
-        <w:rPr>
-          <w:lang w:val="ru-RU"/>
-        </w:rPr>
-      </w:pPr>
-      <w:r>
-        <w:rPr>
-          <w:rFonts w:ascii="Times New Roman" w:hAnsi="Times New Roman"/>
-          <w:b w:val="false"/>
-          <w:i w:val="false"/>
-          <w:caps w:val="false"/>
-          <w:smallCaps w:val="false"/>
-          <w:color w:val="000000"/>
-          <w:spacing w:val="0"/>
-          <w:sz w:val="22"/>
-          <w:szCs w:val="22"/>
+        <w:ind w:hanging="0" w:left="0" w:right="0"/>
+        <w:rPr>
+          <w:lang w:val="ru-RU"/>
+        </w:rPr>
+      </w:pPr>
+      <w:r>
+        <w:rPr>
+          <w:lang w:val="ru-RU"/>
         </w:rPr>
       </w:r>
     </w:p>
@@ -661,7 +530,7 @@
       <w:pPr>
         <w:pStyle w:val="Normal"/>
         <w:widowControl/>
-        <w:ind w:left="0" w:right="0" w:hanging="0"/>
+        <w:ind w:hanging="0" w:left="0" w:right="0"/>
         <w:jc w:val="center"/>
         <w:rPr>
           <w:i/>
@@ -672,15 +541,9 @@
       </w:pPr>
       <w:r>
         <w:rPr>
-          <w:rFonts w:ascii="Times New Roman" w:hAnsi="Times New Roman"/>
-          <w:b w:val="false"/>
-          <w:i w:val="false"/>
-          <w:caps w:val="false"/>
-          <w:smallCaps w:val="false"/>
-          <w:color w:val="000000"/>
-          <w:spacing w:val="0"/>
-          <w:sz w:val="22"/>
-          <w:szCs w:val="22"/>
+          <w:i/>
+          <w:iCs/>
+          <w:lang w:val="ru-RU"/>
         </w:rPr>
       </w:r>
     </w:p>
@@ -688,7 +551,7 @@
       <w:pPr>
         <w:pStyle w:val="Normal"/>
         <w:widowControl/>
-        <w:ind w:left="0" w:right="0" w:hanging="0"/>
+        <w:ind w:hanging="0" w:left="0" w:right="0"/>
         <w:jc w:val="center"/>
         <w:rPr>
           <w:i/>
@@ -699,15 +562,9 @@
       </w:pPr>
       <w:r>
         <w:rPr>
-          <w:rFonts w:ascii="Times New Roman" w:hAnsi="Times New Roman"/>
-          <w:b w:val="false"/>
-          <w:i w:val="false"/>
-          <w:caps w:val="false"/>
-          <w:smallCaps w:val="false"/>
-          <w:color w:val="000000"/>
-          <w:spacing w:val="0"/>
-          <w:sz w:val="22"/>
-          <w:szCs w:val="22"/>
+          <w:i/>
+          <w:iCs/>
+          <w:lang w:val="ru-RU"/>
         </w:rPr>
       </w:r>
     </w:p>
@@ -715,7 +572,7 @@
       <w:pPr>
         <w:pStyle w:val="Normal"/>
         <w:widowControl/>
-        <w:ind w:left="0" w:right="0" w:hanging="0"/>
+        <w:ind w:hanging="0" w:left="0" w:right="0"/>
         <w:jc w:val="center"/>
         <w:rPr>
           <w:i/>
@@ -726,15 +583,9 @@
       </w:pPr>
       <w:r>
         <w:rPr>
-          <w:rFonts w:ascii="Times New Roman" w:hAnsi="Times New Roman"/>
-          <w:b w:val="false"/>
-          <w:i w:val="false"/>
-          <w:caps w:val="false"/>
-          <w:smallCaps w:val="false"/>
-          <w:color w:val="000000"/>
-          <w:spacing w:val="0"/>
-          <w:sz w:val="22"/>
-          <w:szCs w:val="22"/>
+          <w:i/>
+          <w:iCs/>
+          <w:lang w:val="ru-RU"/>
         </w:rPr>
       </w:r>
     </w:p>
@@ -742,7 +593,7 @@
       <w:pPr>
         <w:pStyle w:val="Normal"/>
         <w:widowControl/>
-        <w:ind w:left="0" w:right="0" w:hanging="0"/>
+        <w:ind w:hanging="0" w:left="0" w:right="0"/>
         <w:jc w:val="center"/>
         <w:rPr>
           <w:i/>
@@ -753,15 +604,9 @@
       </w:pPr>
       <w:r>
         <w:rPr>
-          <w:rFonts w:ascii="Times New Roman" w:hAnsi="Times New Roman"/>
-          <w:b w:val="false"/>
-          <w:i w:val="false"/>
-          <w:caps w:val="false"/>
-          <w:smallCaps w:val="false"/>
-          <w:color w:val="000000"/>
-          <w:spacing w:val="0"/>
-          <w:sz w:val="22"/>
-          <w:szCs w:val="22"/>
+          <w:i/>
+          <w:iCs/>
+          <w:lang w:val="ru-RU"/>
         </w:rPr>
       </w:r>
     </w:p>
@@ -769,7 +614,7 @@
       <w:pPr>
         <w:pStyle w:val="Normal"/>
         <w:widowControl/>
-        <w:ind w:left="0" w:right="0" w:hanging="0"/>
+        <w:ind w:hanging="0" w:left="0" w:right="0"/>
         <w:jc w:val="center"/>
         <w:rPr>
           <w:i/>
@@ -780,15 +625,9 @@
       </w:pPr>
       <w:r>
         <w:rPr>
-          <w:rFonts w:ascii="Times New Roman" w:hAnsi="Times New Roman"/>
-          <w:b w:val="false"/>
-          <w:i w:val="false"/>
-          <w:caps w:val="false"/>
-          <w:smallCaps w:val="false"/>
-          <w:color w:val="000000"/>
-          <w:spacing w:val="0"/>
-          <w:sz w:val="22"/>
-          <w:szCs w:val="22"/>
+          <w:i/>
+          <w:iCs/>
+          <w:lang w:val="ru-RU"/>
         </w:rPr>
       </w:r>
     </w:p>
@@ -796,23 +635,23 @@
       <w:pPr>
         <w:pStyle w:val="Normal"/>
         <w:widowControl/>
-        <w:ind w:left="0" w:right="0" w:hanging="0"/>
+        <w:ind w:hanging="0" w:left="0" w:right="0"/>
         <w:jc w:val="center"/>
         <w:rPr>
           <w:rFonts w:ascii="Times New Roman" w:hAnsi="Times New Roman"/>
           <w:b w:val="false"/>
           <w:i w:val="false"/>
-          <w:caps w:val="false"/>
-          <w:smallCaps w:val="false"/>
-          <w:color w:val="000000"/>
-          <w:spacing w:val="0"/>
-          <w:sz w:val="22"/>
-          <w:szCs w:val="22"/>
-        </w:rPr>
-      </w:pPr>
-      <w:r>
-        <w:rPr>
-          <w:rFonts w:ascii="Times New Roman" w:hAnsi="Times New Roman"/>
+          <w:i w:val="false"/>
+          <w:caps w:val="false"/>
+          <w:smallCaps w:val="false"/>
+          <w:color w:val="000000"/>
+          <w:spacing w:val="0"/>
+          <w:sz w:val="22"/>
+          <w:szCs w:val="22"/>
+        </w:rPr>
+      </w:pPr>
+      <w:r>
+        <w:rPr>
           <w:b w:val="false"/>
           <w:i/>
           <w:iCs/>
@@ -828,7 +667,7 @@
       </w:r>
       <w:r>
         <w:rPr>
-          <w:rFonts w:eastAsia="Arial Unicode MS" w:cs="Arial Unicode MS" w:ascii="Times New Roman" w:hAnsi="Times New Roman"/>
+          <w:rFonts w:eastAsia="Arial Unicode MS" w:cs="Arial Unicode MS"/>
           <w:b w:val="false"/>
           <w:bCs w:val="false"/>
           <w:i/>
@@ -853,11 +692,6 @@
           <w:shd w:fill="auto" w:val="clear"/>
           <w:vertAlign w:val="baseline"/>
           <w:lang w:val="ru-RU" w:eastAsia="zh-CN" w:bidi="hi-IN"/>
-          <w14:textFill>
-            <w14:solidFill>
-              <w14:srgbClr w14:val="000000"/>
-            </w14:solidFill>
-          </w14:textFill>
         </w:rPr>
         <w:t>Диаграмма, демонстрирующая  процесс компановки и верификации класса.</w:t>
       </w:r>
@@ -871,18 +705,22 @@
         </w:rPr>
       </w:pPr>
       <w:r>
-        <w:rPr/>
+        <w:rPr>
+          <w:spacing w:val="0"/>
+          <w:lang w:val="ru-RU"/>
+        </w:rPr>
       </w:r>
     </w:p>
     <w:p>
       <w:pPr>
         <w:pStyle w:val="Normal"/>
         <w:widowControl/>
-        <w:ind w:left="0" w:right="0" w:hanging="0"/>
+        <w:ind w:hanging="0" w:left="0" w:right="0"/>
         <w:rPr>
           <w:rFonts w:ascii="webkit-standard" w:hAnsi="webkit-standard"/>
           <w:b w:val="false"/>
           <w:i w:val="false"/>
+          <w:i w:val="false"/>
           <w:caps w:val="false"/>
           <w:smallCaps w:val="false"/>
           <w:color w:val="000000"/>
@@ -892,7 +730,6 @@
       </w:pPr>
       <w:r>
         <w:rPr>
-          <w:rFonts w:ascii="Times New Roman" w:hAnsi="Times New Roman"/>
           <w:b w:val="false"/>
           <w:i w:val="false"/>
           <w:caps w:val="false"/>
@@ -904,68 +741,28 @@
           <w:lang w:val="ru-RU"/>
         </w:rPr>
         <w:tab/>
-        <w:t xml:space="preserve">В рамках работы были исследованы и разработаны алгоритмы верификации any-байткодов с учётом ключевых требований к процессу проверки: обеспечения корректности типовых преобразований, строгого соответствия </w:t>
-      </w:r>
-      <w:r>
-        <w:rPr>
-          <w:rFonts w:eastAsia="Arial Unicode MS" w:cs="Arial Unicode MS" w:ascii="Times New Roman" w:hAnsi="Times New Roman"/>
-          <w:b w:val="false"/>
-          <w:bCs w:val="false"/>
-          <w:i w:val="false"/>
-          <w:iCs w:val="false"/>
-          <w:caps w:val="false"/>
-          <w:smallCaps w:val="false"/>
-          <w:strike w:val="false"/>
-          <w:dstrike w:val="false"/>
-          <w:outline w:val="false"/>
-          <w:emboss w:val="false"/>
-          <w:imprint w:val="false"/>
-          <w:vanish w:val="false"/>
-          <w:color w:val="000000"/>
-          <w:spacing w:val="0"/>
-          <w:w w:val="100"/>
-          <w:kern w:val="0"/>
-          <w:position w:val="0"/>
-          <w:sz w:val="22"/>
-          <w:sz w:val="22"/>
-          <w:szCs w:val="22"/>
-          <w:u w:val="none" w:color="000000"/>
-          <w:shd w:fill="auto" w:val="clear"/>
-          <w:vertAlign w:val="baseline"/>
-          <w:lang w:val="ru-RU" w:eastAsia="zh-CN" w:bidi="hi-IN"/>
-          <w14:textFill>
-            <w14:solidFill>
-              <w14:srgbClr w14:val="000000"/>
-            </w14:solidFill>
-          </w14:textFill>
-        </w:rPr>
-        <w:t>семантики инструкций</w:t>
-      </w:r>
-      <w:r>
-        <w:rPr>
-          <w:rFonts w:ascii="Times New Roman" w:hAnsi="Times New Roman"/>
-          <w:b w:val="false"/>
-          <w:i w:val="false"/>
-          <w:caps w:val="false"/>
-          <w:smallCaps w:val="false"/>
-          <w:color w:val="000000"/>
-          <w:spacing w:val="0"/>
-          <w:sz w:val="22"/>
-          <w:szCs w:val="22"/>
-          <w:lang w:val="ru-RU"/>
-        </w:rPr>
-        <w:t>, а также сохранения гарантии типовой безопасности на всех этапах анализа. </w:t>
+        <w:t>Целевая платформа в рамках своей системы типов предусматривает поддержку типов, разрешаемых на этапе выполнения программы. В отличие от статической модели, такая система допускает существование типов, конкретное значение которых может изменяться в процессе исполнения, что требует специальных механизмов анализа и контроля со стороны верификатора.</w:t>
       </w:r>
     </w:p>
     <w:p>
       <w:pPr>
         <w:pStyle w:val="Normal"/>
-        <w:ind w:left="0" w:right="0" w:hanging="0"/>
-        <w:rPr/>
-      </w:pPr>
-      <w:r>
-        <w:rPr>
-          <w:rFonts w:ascii="Times New Roman" w:hAnsi="Times New Roman"/>
+        <w:widowControl/>
+        <w:ind w:hanging="0" w:left="0" w:right="0"/>
+        <w:rPr>
+          <w:rFonts w:ascii="webkit-standard" w:hAnsi="webkit-standard"/>
+          <w:b w:val="false"/>
+          <w:i w:val="false"/>
+          <w:i w:val="false"/>
+          <w:caps w:val="false"/>
+          <w:smallCaps w:val="false"/>
+          <w:color w:val="000000"/>
+          <w:spacing w:val="0"/>
+          <w:sz w:val="28"/>
+        </w:rPr>
+      </w:pPr>
+      <w:r>
+        <w:rPr>
           <w:b w:val="false"/>
           <w:i w:val="false"/>
           <w:caps w:val="false"/>
@@ -977,29 +774,109 @@
           <w:lang w:val="ru-RU"/>
         </w:rPr>
         <w:tab/>
-        <w:t>Кроме того, в систему верификации типов были интегрированы union-типы и разработаны алгоритмы их статической проверки. Это позволило повысить безопасность платформы и предотвратить ряд ошибок времени выполнения ещё на этапе верификации при установке.</w:t>
+      </w:r>
+      <w:r>
+        <w:rPr>
+          <w:b w:val="false"/>
+          <w:i w:val="false"/>
+          <w:caps w:val="false"/>
+          <w:smallCaps w:val="false"/>
+          <w:color w:val="000000"/>
+          <w:spacing w:val="0"/>
+          <w:sz w:val="22"/>
+          <w:szCs w:val="22"/>
+        </w:rPr>
+        <w:t>К числу таких типов относится union-тип — составной тип данных, представляющий объединение нескольких заранее определённых вариантов. Объект, имеющий union-тип, может во время выполнения принимать значение любого из входящих в объединение типов, при этом корректность операций над ним должна подтверждаться с учётом всех возможных вариантов. Это существенно усложняет задачу статической проверки, поскольку верификатору необходимо учитывать множество потенциальных ветвей типового состояния.</w:t>
       </w:r>
     </w:p>
     <w:p>
       <w:pPr>
         <w:pStyle w:val="BodyText"/>
         <w:widowControl/>
-        <w:ind w:left="0" w:right="0" w:hanging="0"/>
-        <w:rPr>
-          <w:rFonts w:ascii="Times New Roman" w:hAnsi="Times New Roman"/>
-          <w:b w:val="false"/>
-          <w:i w:val="false"/>
-          <w:caps w:val="false"/>
-          <w:smallCaps w:val="false"/>
-          <w:color w:val="000000"/>
-          <w:spacing w:val="0"/>
-          <w:sz w:val="22"/>
-          <w:szCs w:val="22"/>
-        </w:rPr>
-      </w:pPr>
-      <w:r>
-        <w:rPr>
-          <w:rFonts w:ascii="Times New Roman" w:hAnsi="Times New Roman"/>
+        <w:ind w:hanging="0" w:left="0" w:right="0"/>
+        <w:rPr>
+          <w:b w:val="false"/>
+          <w:i w:val="false"/>
+          <w:i w:val="false"/>
+          <w:caps w:val="false"/>
+          <w:smallCaps w:val="false"/>
+          <w:color w:val="000000"/>
+          <w:spacing w:val="0"/>
+          <w:sz w:val="22"/>
+          <w:szCs w:val="22"/>
+        </w:rPr>
+      </w:pPr>
+      <w:r>
+        <w:rPr>
+          <w:b w:val="false"/>
+          <w:i w:val="false"/>
+          <w:caps w:val="false"/>
+          <w:smallCaps w:val="false"/>
+          <w:color w:val="000000"/>
+          <w:spacing w:val="0"/>
+          <w:sz w:val="22"/>
+          <w:szCs w:val="22"/>
+        </w:rPr>
+        <w:tab/>
+        <w:t xml:space="preserve">Кроме того, система типов в себе имеет any-тип, который допускает присвоение объекту значения произвольного типа, включая те, которые определяются на стороне динамически типизированного языка программирования (контекст интеропа). Использование any-типа предоставляет максимальную гибкость при взаимодействии с динамически типизированными компонентами, однако одновременно создаёт дополнительные требования к механизмам верификации. </w:t>
+      </w:r>
+    </w:p>
+    <w:p>
+      <w:pPr>
+        <w:pStyle w:val="BodyText"/>
+        <w:widowControl/>
+        <w:spacing w:before="0" w:after="0"/>
+        <w:ind w:hanging="0" w:left="0" w:right="0"/>
+        <w:rPr>
+          <w:b w:val="false"/>
+          <w:i w:val="false"/>
+          <w:i w:val="false"/>
+          <w:caps w:val="false"/>
+          <w:smallCaps w:val="false"/>
+          <w:color w:val="000000"/>
+          <w:spacing w:val="0"/>
+          <w:sz w:val="22"/>
+          <w:szCs w:val="22"/>
+        </w:rPr>
+      </w:pPr>
+      <w:r>
+        <w:rPr>
+          <w:b w:val="false"/>
+          <w:i w:val="false"/>
+          <w:caps w:val="false"/>
+          <w:smallCaps w:val="false"/>
+          <w:color w:val="000000"/>
+          <w:spacing w:val="0"/>
+          <w:sz w:val="22"/>
+          <w:szCs w:val="22"/>
+        </w:rPr>
+        <w:tab/>
+      </w:r>
+      <w:r>
+        <w:rPr/>
+        <w:t>В ходе работы, в систему верификаторных типов были интегрированы union-типы и разработаны алгоритмы верификации инструкций имеющих динамический характер. Это позволило повысить безопасность платформы и предотвратить ряд ошибок времени выполнения ещё на этапе верификации при установке.</w:t>
+      </w:r>
+    </w:p>
+    <w:p>
+      <w:pPr>
+        <w:pStyle w:val="BodyText"/>
+        <w:widowControl/>
+        <w:spacing w:before="0" w:after="0"/>
+        <w:ind w:hanging="0" w:left="0" w:right="0"/>
+        <w:rPr>
+          <w:b w:val="false"/>
+          <w:i w:val="false"/>
+          <w:i w:val="false"/>
+          <w:caps w:val="false"/>
+          <w:smallCaps w:val="false"/>
+          <w:color w:val="000000"/>
+          <w:spacing w:val="0"/>
+          <w:sz w:val="22"/>
+          <w:szCs w:val="22"/>
+        </w:rPr>
+      </w:pPr>
+      <w:r>
+        <w:rPr>
           <w:b w:val="false"/>
           <w:i w:val="false"/>
           <w:caps w:val="false"/>
@@ -1016,11 +893,19 @@
     <w:p>
       <w:pPr>
         <w:pStyle w:val="FigureNameText"/>
+        <w:spacing w:lineRule="auto" w:line="240"/>
         <w:jc w:val="both"/>
-        <w:rPr/>
-      </w:pPr>
-      <w:r>
-        <w:rPr/>
+        <w:rPr>
+          <w:rFonts w:ascii="Times New Roman" w:hAnsi="Times New Roman"/>
+          <w:sz w:val="22"/>
+          <w:szCs w:val="22"/>
+        </w:rPr>
+      </w:pPr>
+      <w:r>
+        <w:rPr>
+          <w:sz w:val="22"/>
+          <w:szCs w:val="22"/>
+        </w:rPr>
       </w:r>
     </w:p>
     <w:p>
@@ -1043,7 +928,7 @@
           <w:numId w:val="1"/>
         </w:numPr>
         <w:spacing w:before="0" w:after="0"/>
-        <w:ind w:left="502" w:right="0" w:hanging="360"/>
+        <w:ind w:hanging="360" w:left="502" w:right="0"/>
         <w:rPr/>
       </w:pPr>
       <w:r>
@@ -1053,7 +938,7 @@
       <w:hyperlink r:id="rId3">
         <w:r>
           <w:rPr>
-            <w:rStyle w:val="InternetLink"/>
+            <w:rStyle w:val="Hyperlink"/>
           </w:rPr>
           <w:t>https://gitcode.com/igelhaus/arkcompiler_runtime_core/releases</w:t>
         </w:r>
@@ -1071,7 +956,7 @@
           <w:numId w:val="1"/>
         </w:numPr>
         <w:spacing w:before="0" w:after="0"/>
-        <w:ind w:left="502" w:right="0" w:hanging="360"/>
+        <w:ind w:hanging="360" w:left="502" w:right="0"/>
         <w:rPr/>
       </w:pPr>
       <w:r>
@@ -1081,7 +966,7 @@
       <w:hyperlink r:id="rId4">
         <w:r>
           <w:rPr>
-            <w:rStyle w:val="InternetLink"/>
+            <w:rStyle w:val="Hyperlink"/>
           </w:rPr>
           <w:t>https://tc39.es/ecma262</w:t>
         </w:r>
@@ -1099,7 +984,7 @@
           <w:numId w:val="1"/>
         </w:numPr>
         <w:spacing w:before="0" w:after="0"/>
-        <w:ind w:left="502" w:right="0" w:hanging="360"/>
+        <w:ind w:hanging="360" w:left="502" w:right="0"/>
         <w:rPr/>
       </w:pPr>
       <w:r>
@@ -1109,7 +994,7 @@
       <w:hyperlink r:id="rId5">
         <w:r>
           <w:rPr>
-            <w:rStyle w:val="InternetLink"/>
+            <w:rStyle w:val="Hyperlink"/>
           </w:rPr>
           <w:t>https://docs.oracle.com/javase/specs/jvms/se8/html</w:t>
         </w:r>
@@ -1120,8 +1005,12 @@
       </w:r>
     </w:p>
     <w:sectPr>
-      <w:headerReference w:type="default" r:id="rId6"/>
-      <w:footerReference w:type="default" r:id="rId7"/>
+      <w:headerReference w:type="even" r:id="rId6"/>
+      <w:headerReference w:type="default" r:id="rId7"/>
+      <w:headerReference w:type="first" r:id="rId8"/>
+      <w:footerReference w:type="even" r:id="rId9"/>
+      <w:footerReference w:type="default" r:id="rId10"/>
+      <w:footerReference w:type="first" r:id="rId11"/>
       <w:type w:val="nextPage"/>
       <w:pgSz w:w="11906" w:h="16838"/>
       <w:pgMar w:left="1021" w:right="1021" w:gutter="0" w:header="0" w:top="1021" w:footer="851" w:bottom="1247"/>
@@ -1135,7 +1024,64 @@
 </file>
 
 <file path=word/footer1.xml><?xml version="1.0" encoding="utf-8"?>
-<w:ftr xmlns:o="urn:schemas-microsoft-com:office:office" xmlns:r="http://schemas.openxmlformats.org/officeDocument/2006/relationships" xmlns:v="urn:schemas-microsoft-com:vml" xmlns:w="http://schemas.openxmlformats.org/wordprocessingml/2006/main" xmlns:w10="urn:schemas-microsoft-com:office:word" xmlns:wp="http://schemas.openxmlformats.org/drawingml/2006/wordprocessingDrawing" xmlns:wps="http://schemas.microsoft.com/office/word/2010/wordprocessingShape" xmlns:wpg="http://schemas.microsoft.com/office/word/2010/wordprocessingGroup" xmlns:mc="http://schemas.openxmlformats.org/markup-compatibility/2006" xmlns:wp14="http://schemas.microsoft.com/office/word/2010/wordprocessingDrawing" xmlns:w14="http://schemas.microsoft.com/office/word/2010/wordml" xmlns:w15="http://schemas.microsoft.com/office/word/2012/wordml" mc:Ignorable="w14 wp14 w15">
+<w:ftr xmlns:o="urn:schemas-microsoft-com:office:office" xmlns:r="http://schemas.openxmlformats.org/officeDocument/2006/relationships" xmlns:v="urn:schemas-microsoft-com:vml" xmlns:w="http://schemas.openxmlformats.org/wordprocessingml/2006/main" xmlns:w10="urn:schemas-microsoft-com:office:word" xmlns:wp="http://schemas.openxmlformats.org/drawingml/2006/wordprocessingDrawing" xmlns:pic="http://schemas.openxmlformats.org/drawingml/2006/picture" xmlns:wps="http://schemas.microsoft.com/office/word/2010/wordprocessingShape" xmlns:wpg="http://schemas.microsoft.com/office/word/2010/wordprocessingGroup" xmlns:mc="http://schemas.openxmlformats.org/markup-compatibility/2006" xmlns:wp14="http://schemas.microsoft.com/office/word/2010/wordprocessingDrawing" xmlns:w14="http://schemas.microsoft.com/office/word/2010/wordml" xmlns:w15="http://schemas.microsoft.com/office/word/2012/wordml" mc:Ignorable="w14 wp14 w15">
+  <w:p>
+    <w:pPr>
+      <w:pStyle w:val="Footer"/>
+      <w:rPr/>
+    </w:pPr>
+    <w:r>
+      <w:rPr/>
+    </w:r>
+  </w:p>
+</w:ftr>
+</file>
+
+<file path=word/footer2.xml><?xml version="1.0" encoding="utf-8"?>
+<w:ftr xmlns:o="urn:schemas-microsoft-com:office:office" xmlns:r="http://schemas.openxmlformats.org/officeDocument/2006/relationships" xmlns:v="urn:schemas-microsoft-com:vml" xmlns:w="http://schemas.openxmlformats.org/wordprocessingml/2006/main" xmlns:w10="urn:schemas-microsoft-com:office:word" xmlns:wp="http://schemas.openxmlformats.org/drawingml/2006/wordprocessingDrawing" xmlns:pic="http://schemas.openxmlformats.org/drawingml/2006/picture" xmlns:wps="http://schemas.microsoft.com/office/word/2010/wordprocessingShape" xmlns:wpg="http://schemas.microsoft.com/office/word/2010/wordprocessingGroup" xmlns:mc="http://schemas.openxmlformats.org/markup-compatibility/2006" xmlns:wp14="http://schemas.microsoft.com/office/word/2010/wordprocessingDrawing" xmlns:w14="http://schemas.microsoft.com/office/word/2010/wordml" xmlns:w15="http://schemas.microsoft.com/office/word/2012/wordml" mc:Ignorable="w14 wp14 w15">
+  <w:p>
+    <w:pPr>
+      <w:pStyle w:val="Footer"/>
+      <w:rPr/>
+    </w:pPr>
+    <w:r>
+      <w:rPr>
+        <w:lang w:val="ru-RU"/>
+      </w:rPr>
+      <w:t>––––––––</w:t>
+    </w:r>
+  </w:p>
+  <w:p>
+    <w:pPr>
+      <w:pStyle w:val="Footer"/>
+      <w:rPr/>
+    </w:pPr>
+    <w:r>
+      <w:rPr/>
+      <w:fldChar w:fldCharType="begin"/>
+    </w:r>
+    <w:r>
+      <w:rPr/>
+      <w:instrText xml:space="preserve"> PAGE </w:instrText>
+    </w:r>
+    <w:r>
+      <w:rPr/>
+      <w:fldChar w:fldCharType="separate"/>
+    </w:r>
+    <w:r>
+      <w:rPr/>
+      <w:t>2</w:t>
+    </w:r>
+    <w:r>
+      <w:rPr/>
+      <w:fldChar w:fldCharType="end"/>
+    </w:r>
+  </w:p>
+</w:ftr>
+</file>
+
+<file path=word/footer3.xml><?xml version="1.0" encoding="utf-8"?>
+<w:ftr xmlns:o="urn:schemas-microsoft-com:office:office" xmlns:r="http://schemas.openxmlformats.org/officeDocument/2006/relationships" xmlns:v="urn:schemas-microsoft-com:vml" xmlns:w="http://schemas.openxmlformats.org/wordprocessingml/2006/main" xmlns:w10="urn:schemas-microsoft-com:office:word" xmlns:wp="http://schemas.openxmlformats.org/drawingml/2006/wordprocessingDrawing" xmlns:pic="http://schemas.openxmlformats.org/drawingml/2006/picture" xmlns:wps="http://schemas.microsoft.com/office/word/2010/wordprocessingShape" xmlns:wpg="http://schemas.microsoft.com/office/word/2010/wordprocessingGroup" xmlns:mc="http://schemas.openxmlformats.org/markup-compatibility/2006" xmlns:wp14="http://schemas.microsoft.com/office/word/2010/wordprocessingDrawing" xmlns:w14="http://schemas.microsoft.com/office/word/2010/wordml" xmlns:w15="http://schemas.microsoft.com/office/word/2012/wordml" mc:Ignorable="w14 wp14 w15">
   <w:p>
     <w:pPr>
       <w:pStyle w:val="Footer"/>
@@ -1178,7 +1124,36 @@
 </file>
 
 <file path=word/header1.xml><?xml version="1.0" encoding="utf-8"?>
-<w:hdr xmlns:o="urn:schemas-microsoft-com:office:office" xmlns:r="http://schemas.openxmlformats.org/officeDocument/2006/relationships" xmlns:v="urn:schemas-microsoft-com:vml" xmlns:w="http://schemas.openxmlformats.org/wordprocessingml/2006/main" xmlns:w10="urn:schemas-microsoft-com:office:word" xmlns:wp="http://schemas.openxmlformats.org/drawingml/2006/wordprocessingDrawing" xmlns:wps="http://schemas.microsoft.com/office/word/2010/wordprocessingShape" xmlns:wpg="http://schemas.microsoft.com/office/word/2010/wordprocessingGroup" xmlns:mc="http://schemas.openxmlformats.org/markup-compatibility/2006" xmlns:wp14="http://schemas.microsoft.com/office/word/2010/wordprocessingDrawing" xmlns:w14="http://schemas.microsoft.com/office/word/2010/wordml" xmlns:w15="http://schemas.microsoft.com/office/word/2012/wordml" mc:Ignorable="w14 wp14 w15">
+<w:hdr xmlns:o="urn:schemas-microsoft-com:office:office" xmlns:r="http://schemas.openxmlformats.org/officeDocument/2006/relationships" xmlns:v="urn:schemas-microsoft-com:vml" xmlns:w="http://schemas.openxmlformats.org/wordprocessingml/2006/main" xmlns:w10="urn:schemas-microsoft-com:office:word" xmlns:wp="http://schemas.openxmlformats.org/drawingml/2006/wordprocessingDrawing" xmlns:pic="http://schemas.openxmlformats.org/drawingml/2006/picture" xmlns:wps="http://schemas.microsoft.com/office/word/2010/wordprocessingShape" xmlns:wpg="http://schemas.microsoft.com/office/word/2010/wordprocessingGroup" xmlns:mc="http://schemas.openxmlformats.org/markup-compatibility/2006" xmlns:wp14="http://schemas.microsoft.com/office/word/2010/wordprocessingDrawing" xmlns:w14="http://schemas.microsoft.com/office/word/2010/wordml" xmlns:w15="http://schemas.microsoft.com/office/word/2012/wordml" mc:Ignorable="w14 wp14 w15">
+  <w:p>
+    <w:pPr>
+      <w:pStyle w:val="Header"/>
+      <w:rPr/>
+    </w:pPr>
+    <w:r>
+      <w:rPr/>
+    </w:r>
+  </w:p>
+</w:hdr>
+</file>
+
+<file path=word/header2.xml><?xml version="1.0" encoding="utf-8"?>
+<w:hdr xmlns:o="urn:schemas-microsoft-com:office:office" xmlns:r="http://schemas.openxmlformats.org/officeDocument/2006/relationships" xmlns:v="urn:schemas-microsoft-com:vml" xmlns:w="http://schemas.openxmlformats.org/wordprocessingml/2006/main" xmlns:w10="urn:schemas-microsoft-com:office:word" xmlns:wp="http://schemas.openxmlformats.org/drawingml/2006/wordprocessingDrawing" xmlns:pic="http://schemas.openxmlformats.org/drawingml/2006/picture" xmlns:wps="http://schemas.microsoft.com/office/word/2010/wordprocessingShape" xmlns:wpg="http://schemas.microsoft.com/office/word/2010/wordprocessingGroup" xmlns:mc="http://schemas.openxmlformats.org/markup-compatibility/2006" xmlns:wp14="http://schemas.microsoft.com/office/word/2010/wordprocessingDrawing" xmlns:w14="http://schemas.microsoft.com/office/word/2010/wordml" xmlns:w15="http://schemas.microsoft.com/office/word/2012/wordml" mc:Ignorable="w14 wp14 w15">
+  <w:p>
+    <w:pPr>
+      <w:pStyle w:val="HeaderFooter"/>
+      <w:bidi w:val="0"/>
+      <w:rPr/>
+    </w:pPr>
+    <w:r>
+      <w:rPr/>
+    </w:r>
+  </w:p>
+</w:hdr>
+</file>
+
+<file path=word/header3.xml><?xml version="1.0" encoding="utf-8"?>
+<w:hdr xmlns:o="urn:schemas-microsoft-com:office:office" xmlns:r="http://schemas.openxmlformats.org/officeDocument/2006/relationships" xmlns:v="urn:schemas-microsoft-com:vml" xmlns:w="http://schemas.openxmlformats.org/wordprocessingml/2006/main" xmlns:w10="urn:schemas-microsoft-com:office:word" xmlns:wp="http://schemas.openxmlformats.org/drawingml/2006/wordprocessingDrawing" xmlns:pic="http://schemas.openxmlformats.org/drawingml/2006/picture" xmlns:wps="http://schemas.microsoft.com/office/word/2010/wordprocessingShape" xmlns:wpg="http://schemas.microsoft.com/office/word/2010/wordprocessingGroup" xmlns:mc="http://schemas.openxmlformats.org/markup-compatibility/2006" xmlns:wp14="http://schemas.microsoft.com/office/word/2010/wordprocessingDrawing" xmlns:w14="http://schemas.microsoft.com/office/word/2010/wordml" xmlns:w15="http://schemas.microsoft.com/office/word/2012/wordml" mc:Ignorable="w14 wp14 w15">
   <w:p>
     <w:pPr>
       <w:pStyle w:val="HeaderFooter"/>
@@ -1657,7 +1632,7 @@
       <w:suppressAutoHyphens w:val="false"/>
       <w:bidi w:val="0"/>
       <w:spacing w:lineRule="auto" w:line="240" w:beforeAutospacing="0" w:before="0" w:afterAutospacing="0" w:after="0"/>
-      <w:ind w:left="0" w:right="0" w:firstLine="567"/>
+      <w:ind w:firstLine="567" w:left="0" w:right="0"/>
       <w:jc w:val="both"/>
     </w:pPr>
     <w:rPr>
@@ -1686,11 +1661,6 @@
       <w:shd w:fill="auto" w:val="clear"/>
       <w:vertAlign w:val="baseline"/>
       <w:lang w:val="ru-RU" w:eastAsia="zh-CN" w:bidi="hi-IN"/>
-      <w14:textFill>
-        <w14:solidFill>
-          <w14:srgbClr w14:val="000000"/>
-        </w14:solidFill>
-      </w14:textFill>
     </w:rPr>
   </w:style>
   <w:style w:type="character" w:styleId="DefaultParagraphFont" w:default="1">
@@ -1698,7 +1668,7 @@
     <w:qFormat/>
     <w:rPr/>
   </w:style>
-  <w:style w:type="character" w:styleId="InternetLink">
+  <w:style w:type="character" w:styleId="Hyperlink">
     <w:name w:val="Hyperlink"/>
     <w:rPr>
       <w:u w:val="single" w:color="FFFFFF"/>
@@ -1707,7 +1677,7 @@
   <w:style w:type="paragraph" w:styleId="Heading">
     <w:name w:val="Heading"/>
     <w:basedOn w:val="Normal"/>
-    <w:next w:val="TextBody"/>
+    <w:next w:val="BodyText"/>
     <w:qFormat/>
     <w:pPr>
       <w:keepNext w:val="true"/>
@@ -1719,7 +1689,7 @@
       <w:szCs w:val="28"/>
     </w:rPr>
   </w:style>
-  <w:style w:type="paragraph" w:styleId="TextBody">
+  <w:style w:type="paragraph" w:styleId="BodyText">
     <w:name w:val="Body Text"/>
     <w:basedOn w:val="Normal"/>
     <w:pPr>
@@ -1729,14 +1699,14 @@
   </w:style>
   <w:style w:type="paragraph" w:styleId="List">
     <w:name w:val="List"/>
-    <w:basedOn w:val="TextBody"/>
+    <w:basedOn w:val="BodyText"/>
     <w:pPr/>
     <w:rPr>
       <w:rFonts w:cs="Arial Unicode MS"/>
     </w:rPr>
   </w:style>
   <w:style w:type="paragraph" w:styleId="Caption">
-    <w:name w:val="Caption"/>
+    <w:name w:val="caption"/>
     <w:basedOn w:val="Normal"/>
     <w:qFormat/>
     <w:pPr>
@@ -1779,7 +1749,7 @@
       <w:suppressAutoHyphens w:val="false"/>
       <w:bidi w:val="0"/>
       <w:spacing w:lineRule="auto" w:line="240" w:beforeAutospacing="0" w:before="0" w:afterAutospacing="0" w:after="0"/>
-      <w:ind w:left="0" w:right="0" w:hanging="0"/>
+      <w:ind w:hanging="0" w:left="0" w:right="0"/>
       <w:jc w:val="left"/>
     </w:pPr>
     <w:rPr>
@@ -1811,11 +1781,6 @@
       <w14:textOutline>
         <w14:noFill/>
       </w14:textOutline>
-      <w14:textFill>
-        <w14:solidFill>
-          <w14:srgbClr w14:val="000000"/>
-        </w14:solidFill>
-      </w14:textFill>
     </w:rPr>
   </w:style>
   <w:style w:type="paragraph" w:styleId="HeaderandFooter">
@@ -1826,7 +1791,7 @@
     <w:rPr/>
   </w:style>
   <w:style w:type="paragraph" w:styleId="Footer">
-    <w:name w:val="Footer"/>
+    <w:name w:val="footer"/>
     <w:pPr>
       <w:keepNext w:val="false"/>
       <w:keepLines w:val="false"/>
@@ -1841,7 +1806,7 @@
       <w:suppressAutoHyphens w:val="false"/>
       <w:bidi w:val="0"/>
       <w:spacing w:lineRule="auto" w:line="180" w:beforeAutospacing="0" w:before="0" w:afterAutospacing="0" w:after="0"/>
-      <w:ind w:left="0" w:right="0" w:firstLine="567"/>
+      <w:ind w:firstLine="567" w:left="0" w:right="0"/>
       <w:jc w:val="center"/>
     </w:pPr>
     <w:rPr>
@@ -1870,11 +1835,6 @@
       <w:shd w:fill="auto" w:val="clear"/>
       <w:vertAlign w:val="baseline"/>
       <w:lang w:val="ru-RU" w:eastAsia="zh-CN" w:bidi="hi-IN"/>
-      <w14:textFill>
-        <w14:solidFill>
-          <w14:srgbClr w14:val="000000"/>
-        </w14:solidFill>
-      </w14:textFill>
     </w:rPr>
   </w:style>
   <w:style w:type="paragraph" w:styleId="Style14">
@@ -1890,7 +1850,7 @@
       <w:suppressAutoHyphens w:val="false"/>
       <w:bidi w:val="0"/>
       <w:spacing w:lineRule="auto" w:line="240" w:beforeAutospacing="0" w:before="600" w:afterAutospacing="0" w:after="0"/>
-      <w:ind w:left="0" w:right="0" w:firstLine="567"/>
+      <w:ind w:firstLine="567" w:left="0" w:right="0"/>
       <w:jc w:val="both"/>
     </w:pPr>
     <w:rPr>
@@ -1919,11 +1879,6 @@
       <w:shd w:fill="auto" w:val="clear"/>
       <w:vertAlign w:val="baseline"/>
       <w:lang w:val="ru-RU" w:eastAsia="zh-CN" w:bidi="hi-IN"/>
-      <w14:textFill>
-        <w14:solidFill>
-          <w14:srgbClr w14:val="000000"/>
-        </w14:solidFill>
-      </w14:textFill>
     </w:rPr>
   </w:style>
   <w:style w:type="paragraph" w:styleId="Title">
@@ -1939,7 +1894,7 @@
       <w:suppressAutoHyphens w:val="true"/>
       <w:bidi w:val="0"/>
       <w:spacing w:lineRule="auto" w:line="240" w:beforeAutospacing="0" w:before="160" w:afterAutospacing="0" w:after="60"/>
-      <w:ind w:left="0" w:right="0" w:hanging="0"/>
+      <w:ind w:hanging="0" w:left="0" w:right="0"/>
       <w:jc w:val="center"/>
     </w:pPr>
     <w:rPr>
@@ -1971,11 +1926,6 @@
       <w14:textOutline>
         <w14:noFill/>
       </w14:textOutline>
-      <w14:textFill>
-        <w14:solidFill>
-          <w14:srgbClr w14:val="000000"/>
-        </w14:solidFill>
-      </w14:textFill>
     </w:rPr>
   </w:style>
   <w:style w:type="paragraph" w:styleId="Authors">
@@ -1991,7 +1941,7 @@
       <w:suppressAutoHyphens w:val="true"/>
       <w:bidi w:val="0"/>
       <w:spacing w:lineRule="auto" w:line="240" w:beforeAutospacing="0" w:before="240" w:afterAutospacing="0" w:after="0"/>
-      <w:ind w:left="0" w:right="0" w:firstLine="567"/>
+      <w:ind w:firstLine="567" w:left="0" w:right="0"/>
       <w:jc w:val="center"/>
       <w:outlineLvl w:val="0"/>
     </w:pPr>
@@ -2021,11 +1971,6 @@
       <w:shd w:fill="auto" w:val="clear"/>
       <w:vertAlign w:val="baseline"/>
       <w:lang w:val="en-US" w:eastAsia="zh-CN" w:bidi="hi-IN"/>
-      <w14:textFill>
-        <w14:solidFill>
-          <w14:srgbClr w14:val="000000"/>
-        </w14:solidFill>
-      </w14:textFill>
     </w:rPr>
   </w:style>
   <w:style w:type="paragraph" w:styleId="Organization">
@@ -2040,7 +1985,7 @@
       <w:suppressAutoHyphens w:val="true"/>
       <w:bidi w:val="0"/>
       <w:spacing w:lineRule="auto" w:line="240" w:beforeAutospacing="0" w:before="120" w:afterAutospacing="0" w:after="240"/>
-      <w:ind w:left="0" w:right="0" w:firstLine="567"/>
+      <w:ind w:firstLine="567" w:left="0" w:right="0"/>
       <w:jc w:val="center"/>
     </w:pPr>
     <w:rPr>
@@ -2069,11 +2014,6 @@
       <w:shd w:fill="auto" w:val="clear"/>
       <w:vertAlign w:val="baseline"/>
       <w:lang w:val="ru-RU" w:eastAsia="zh-CN" w:bidi="hi-IN"/>
-      <w14:textFill>
-        <w14:solidFill>
-          <w14:srgbClr w14:val="000000"/>
-        </w14:solidFill>
-      </w14:textFill>
     </w:rPr>
   </w:style>
   <w:style w:type="paragraph" w:styleId="FigureNameText">
@@ -2088,7 +2028,7 @@
       <w:suppressAutoHyphens w:val="true"/>
       <w:bidi w:val="0"/>
       <w:spacing w:lineRule="auto" w:line="240" w:beforeAutospacing="0" w:before="120" w:afterAutospacing="0" w:after="240"/>
-      <w:ind w:left="0" w:right="0" w:firstLine="567"/>
+      <w:ind w:firstLine="567" w:left="0" w:right="0"/>
       <w:jc w:val="center"/>
     </w:pPr>
     <w:rPr>
@@ -2117,14 +2057,9 @@
       <w:shd w:fill="auto" w:val="clear"/>
       <w:vertAlign w:val="baseline"/>
       <w:lang w:val="ru-RU" w:eastAsia="zh-CN" w:bidi="hi-IN"/>
-      <w14:textFill>
-        <w14:solidFill>
-          <w14:srgbClr w14:val="000000"/>
-        </w14:solidFill>
-      </w14:textFill>
     </w:rPr>
   </w:style>
-  <w:style w:type="paragraph" w:styleId="BodyText">
+  <w:style w:type="paragraph" w:styleId="BodyText1">
     <w:name w:val="!! Body Text"/>
     <w:qFormat/>
     <w:pPr>
@@ -2136,7 +2071,7 @@
       <w:suppressAutoHyphens w:val="false"/>
       <w:bidi w:val="0"/>
       <w:spacing w:lineRule="auto" w:line="240" w:beforeAutospacing="0" w:before="0" w:afterAutospacing="0" w:after="0"/>
-      <w:ind w:left="0" w:right="0" w:firstLine="567"/>
+      <w:ind w:firstLine="567" w:left="0" w:right="0"/>
       <w:jc w:val="both"/>
     </w:pPr>
     <w:rPr>
@@ -2165,11 +2100,6 @@
       <w:shd w:fill="auto" w:val="clear"/>
       <w:vertAlign w:val="baseline"/>
       <w:lang w:val="ru-RU" w:eastAsia="zh-CN" w:bidi="hi-IN"/>
-      <w14:textFill>
-        <w14:solidFill>
-          <w14:srgbClr w14:val="000000"/>
-        </w14:solidFill>
-      </w14:textFill>
     </w:rPr>
   </w:style>
   <w:style w:type="paragraph" w:styleId="Literature">
@@ -2184,7 +2114,7 @@
       <w:suppressAutoHyphens w:val="false"/>
       <w:bidi w:val="0"/>
       <w:spacing w:lineRule="auto" w:line="240" w:beforeAutospacing="0" w:before="240" w:afterAutospacing="0" w:after="120"/>
-      <w:ind w:left="0" w:right="0" w:firstLine="567"/>
+      <w:ind w:firstLine="567" w:left="0" w:right="0"/>
       <w:jc w:val="center"/>
     </w:pPr>
     <w:rPr>
@@ -2213,11 +2143,6 @@
       <w:shd w:fill="auto" w:val="clear"/>
       <w:vertAlign w:val="baseline"/>
       <w:lang w:val="ru-RU" w:eastAsia="zh-CN" w:bidi="hi-IN"/>
-      <w14:textFill>
-        <w14:solidFill>
-          <w14:srgbClr w14:val="000000"/>
-        </w14:solidFill>
-      </w14:textFill>
     </w:rPr>
   </w:style>
   <w:style w:type="paragraph" w:styleId="References">
@@ -2232,7 +2157,7 @@
       <w:suppressAutoHyphens w:val="true"/>
       <w:bidi w:val="0"/>
       <w:spacing w:lineRule="auto" w:line="240" w:beforeAutospacing="0" w:before="0" w:afterAutospacing="0" w:after="0"/>
-      <w:ind w:left="0" w:right="0" w:hanging="0"/>
+      <w:ind w:hanging="0" w:left="0" w:right="0"/>
       <w:jc w:val="both"/>
     </w:pPr>
     <w:rPr>
@@ -2261,15 +2186,10 @@
       <w:shd w:fill="auto" w:val="clear"/>
       <w:vertAlign w:val="baseline"/>
       <w:lang w:val="en-US" w:eastAsia="zh-CN" w:bidi="hi-IN"/>
-      <w14:textFill>
-        <w14:solidFill>
-          <w14:srgbClr w14:val="000000"/>
-        </w14:solidFill>
-      </w14:textFill>
     </w:rPr>
   </w:style>
   <w:style w:type="paragraph" w:styleId="Header">
-    <w:name w:val="Header"/>
+    <w:name w:val="header"/>
     <w:basedOn w:val="HeaderandFooter"/>
     <w:pPr/>
     <w:rPr/>
@@ -2332,1078 +2252,166 @@
         <a:srgbClr val="000000"/>
       </a:dk1>
       <a:lt1>
-        <a:srgbClr val="FFFFFF"/>
+        <a:srgbClr val="ffffff"/>
       </a:lt1>
       <a:dk2>
-        <a:srgbClr val="A7A7A7"/>
+        <a:srgbClr val="a7a7a7"/>
       </a:dk2>
       <a:lt2>
         <a:srgbClr val="535353"/>
       </a:lt2>
       <a:accent1>
-        <a:srgbClr val="4F81BD"/>
+        <a:srgbClr val="4f81bd"/>
       </a:accent1>
       <a:accent2>
-        <a:srgbClr val="C0504D"/>
+        <a:srgbClr val="c0504d"/>
       </a:accent2>
       <a:accent3>
-        <a:srgbClr val="9BBB59"/>
+        <a:srgbClr val="9bbb59"/>
       </a:accent3>
       <a:accent4>
-        <a:srgbClr val="8064A2"/>
+        <a:srgbClr val="8064a2"/>
       </a:accent4>
       <a:accent5>
-        <a:srgbClr val="4BACC6"/>
+        <a:srgbClr val="4bacc6"/>
       </a:accent5>
       <a:accent6>
-        <a:srgbClr val="F79646"/>
+        <a:srgbClr val="f79646"/>
       </a:accent6>
       <a:hlink>
-        <a:srgbClr val="0000FF"/>
+        <a:srgbClr val="0000ff"/>
       </a:hlink>
       <a:folHlink>
-        <a:srgbClr val="FF00FF"/>
+        <a:srgbClr val="ff00ff"/>
       </a:folHlink>
     </a:clrScheme>
     <a:fontScheme name="Тема Office">
       <a:majorFont>
-        <a:latin typeface="Times New Roman"/>
-        <a:ea typeface="Times New Roman"/>
-        <a:cs typeface="Times New Roman"/>
+        <a:latin typeface="Times New Roman" pitchFamily="0" charset="1"/>
+        <a:ea typeface="Times New Roman" pitchFamily="0" charset="1"/>
+        <a:cs typeface="Times New Roman" pitchFamily="0" charset="1"/>
       </a:majorFont>
       <a:minorFont>
-        <a:latin typeface="Helvetica Neue"/>
-        <a:ea typeface="Helvetica Neue"/>
-        <a:cs typeface="Helvetica Neue"/>
+        <a:latin typeface="Helvetica Neue" pitchFamily="0" charset="1"/>
+        <a:ea typeface="Helvetica Neue" pitchFamily="0" charset="1"/>
+        <a:cs typeface="Helvetica Neue" pitchFamily="0" charset="1"/>
       </a:minorFont>
     </a:fontScheme>
-    <a:fmtScheme name="Тема Office">
+    <a:fmtScheme>
       <a:fillStyleLst>
         <a:solidFill>
           <a:schemeClr val="phClr"/>
         </a:solidFill>
-        <a:gradFill rotWithShape="1">
+        <a:gradFill>
           <a:gsLst>
             <a:gs pos="0">
               <a:schemeClr val="phClr">
                 <a:tint val="50000"/>
-                <a:satMod val="300000"/>
               </a:schemeClr>
             </a:gs>
             <a:gs pos="35000">
               <a:schemeClr val="phClr">
                 <a:tint val="37000"/>
-                <a:satMod val="300000"/>
               </a:schemeClr>
             </a:gs>
             <a:gs pos="100000">
               <a:schemeClr val="phClr">
                 <a:tint val="15000"/>
-                <a:satMod val="350000"/>
               </a:schemeClr>
             </a:gs>
           </a:gsLst>
           <a:lin ang="16200000" scaled="1"/>
+          <a:tileRect l="0" t="0" r="0" b="0"/>
         </a:gradFill>
-        <a:gradFill rotWithShape="1">
+        <a:gradFill>
           <a:gsLst>
             <a:gs pos="0">
               <a:schemeClr val="phClr">
                 <a:tint val="100000"/>
                 <a:shade val="100000"/>
-                <a:satMod val="129999"/>
               </a:schemeClr>
             </a:gs>
             <a:gs pos="100000">
               <a:schemeClr val="phClr">
                 <a:tint val="50000"/>
                 <a:shade val="100000"/>
-                <a:satMod val="350000"/>
               </a:schemeClr>
             </a:gs>
           </a:gsLst>
           <a:lin ang="16200000" scaled="0"/>
+          <a:tileRect l="0" t="0" r="0" b="0"/>
         </a:gradFill>
       </a:fillStyleLst>
       <a:lnStyleLst>
         <a:ln w="9525" cap="flat" cmpd="sng" algn="ctr">
-          <a:solidFill>
-            <a:schemeClr val="phClr">
-              <a:shade val="95000"/>
-              <a:satMod val="104999"/>
-            </a:schemeClr>
-          </a:solidFill>
           <a:prstDash val="solid"/>
         </a:ln>
         <a:ln w="25400" cap="flat" cmpd="sng" algn="ctr">
-          <a:solidFill>
-            <a:schemeClr val="phClr"/>
-          </a:solidFill>
           <a:prstDash val="solid"/>
         </a:ln>
         <a:ln w="38100" cap="flat" cmpd="sng" algn="ctr">
-          <a:solidFill>
-            <a:schemeClr val="phClr"/>
-          </a:solidFill>
           <a:prstDash val="solid"/>
         </a:ln>
       </a:lnStyleLst>
       <a:effectStyleLst>
         <a:effectStyle>
-          <a:effectLst>
-            <a:outerShdw sx="100000" sy="100000" kx="0" ky="0" algn="b" rotWithShape="0" blurRad="38100" dist="23000" dir="5400000">
-              <a:srgbClr val="000000">
-                <a:alpha val="35000"/>
-              </a:srgbClr>
-            </a:outerShdw>
-          </a:effectLst>
+          <a:effectLst/>
         </a:effectStyle>
         <a:effectStyle>
-          <a:effectLst>
-            <a:outerShdw sx="100000" sy="100000" kx="0" ky="0" algn="b" rotWithShape="0" blurRad="38100" dist="23000" dir="5400000">
-              <a:srgbClr val="000000">
-                <a:alpha val="35000"/>
-              </a:srgbClr>
-            </a:outerShdw>
-          </a:effectLst>
+          <a:effectLst/>
         </a:effectStyle>
         <a:effectStyle>
-          <a:effectLst>
-            <a:outerShdw sx="100000" sy="100000" kx="0" ky="0" algn="b" rotWithShape="0" blurRad="38100" dist="20000" dir="5400000">
-              <a:srgbClr val="000000">
-                <a:alpha val="38000"/>
-              </a:srgbClr>
-            </a:outerShdw>
-          </a:effectLst>
+          <a:effectLst/>
         </a:effectStyle>
       </a:effectStyleLst>
       <a:bgFillStyleLst>
         <a:solidFill>
           <a:schemeClr val="phClr"/>
         </a:solidFill>
-        <a:gradFill rotWithShape="1">
+        <a:gradFill>
           <a:gsLst>
             <a:gs pos="0">
               <a:schemeClr val="phClr">
                 <a:tint val="40000"/>
-                <a:satMod val="350000"/>
               </a:schemeClr>
             </a:gs>
             <a:gs pos="40000">
               <a:schemeClr val="phClr">
                 <a:tint val="45000"/>
                 <a:shade val="99000"/>
-                <a:satMod val="350000"/>
               </a:schemeClr>
             </a:gs>
             <a:gs pos="100000">
               <a:schemeClr val="phClr">
                 <a:shade val="20000"/>
-                <a:satMod val="255000"/>
               </a:schemeClr>
             </a:gs>
           </a:gsLst>
           <a:path path="circle">
             <a:fillToRect l="50000" t="-80000" r="50000" b="180000"/>
           </a:path>
+          <a:tileRect l="0" t="0" r="0" b="0"/>
         </a:gradFill>
-        <a:gradFill rotWithShape="1">
+        <a:gradFill>
           <a:gsLst>
             <a:gs pos="0">
               <a:schemeClr val="phClr">
                 <a:tint val="80000"/>
-                <a:satMod val="300000"/>
               </a:schemeClr>
             </a:gs>
             <a:gs pos="100000">
               <a:schemeClr val="phClr">
                 <a:shade val="30000"/>
-                <a:satMod val="200000"/>
               </a:schemeClr>
             </a:gs>
           </a:gsLst>
           <a:path path="circle">
             <a:fillToRect l="50000" t="50000" r="50000" b="50000"/>
           </a:path>
+          <a:tileRect l="0" t="0" r="0" b="0"/>
         </a:gradFill>
       </a:bgFillStyleLst>
     </a:fmtScheme>
   </a:themeElements>
-  <a:objectDefaults>
-    <a:spDef>
-      <a:spPr>
-        <a:solidFill>
-          <a:srgbClr val="FFFFFF"/>
-        </a:solidFill>
-        <a:ln w="25400" cap="flat">
-          <a:solidFill>
-            <a:schemeClr val="accent1"/>
-          </a:solidFill>
-          <a:prstDash val="solid"/>
-          <a:round/>
-        </a:ln>
-        <a:effectLst>
-          <a:outerShdw sx="100000" sy="100000" kx="0" ky="0" algn="b" rotWithShape="0" blurRad="38100" dist="23000" dir="5400000">
-            <a:srgbClr val="000000">
-              <a:alpha val="35000"/>
-            </a:srgbClr>
-          </a:outerShdw>
-        </a:effectLst>
-        <a:sp3d/>
-      </a:spPr>
-      <a:bodyPr rot="0" spcFirstLastPara="1" vertOverflow="overflow" horzOverflow="overflow" vert="horz" wrap="square" lIns="45719" tIns="45719" rIns="45719" bIns="45719" numCol="1" spcCol="38100" rtlCol="0" anchor="ctr" upright="0">
-        <a:spAutoFit/>
-      </a:bodyPr>
-      <a:lstStyle>
-        <a:defPPr marL="0" marR="0" indent="0" algn="l" defTabSz="914400" rtl="0" fontAlgn="auto" latinLnBrk="0" hangingPunct="0">
-          <a:lnSpc>
-            <a:spcPct val="100000"/>
-          </a:lnSpc>
-          <a:spcBef>
-            <a:spcPts val="0"/>
-          </a:spcBef>
-          <a:spcAft>
-            <a:spcPts val="0"/>
-          </a:spcAft>
-          <a:buClrTx/>
-          <a:buSzTx/>
-          <a:buFontTx/>
-          <a:buNone/>
-          <a:tabLst/>
-          <a:defRPr b="0" baseline="0" cap="none" i="0" spc="0" strike="noStrike" sz="1800" u="none" kumimoji="0" normalizeH="0">
-            <a:ln>
-              <a:noFill/>
-            </a:ln>
-            <a:solidFill>
-              <a:srgbClr val="000000"/>
-            </a:solidFill>
-            <a:effectLst/>
-            <a:uFillTx/>
-            <a:latin typeface="Calibri"/>
-            <a:ea typeface="Calibri"/>
-            <a:cs typeface="Calibri"/>
-            <a:sym typeface="Calibri"/>
-          </a:defRPr>
-        </a:defPPr>
-        <a:lvl1pPr marL="0" marR="0" indent="0" algn="l" defTabSz="914400" rtl="0" fontAlgn="auto" latinLnBrk="1" hangingPunct="0">
-          <a:lnSpc>
-            <a:spcPct val="100000"/>
-          </a:lnSpc>
-          <a:spcBef>
-            <a:spcPts val="0"/>
-          </a:spcBef>
-          <a:spcAft>
-            <a:spcPts val="0"/>
-          </a:spcAft>
-          <a:buClrTx/>
-          <a:buSzTx/>
-          <a:buFontTx/>
-          <a:buNone/>
-          <a:tabLst/>
-          <a:defRPr b="0" baseline="0" cap="none" i="0" spc="0" strike="noStrike" sz="1800" u="none" kumimoji="0" normalizeH="0">
-            <a:ln>
-              <a:noFill/>
-            </a:ln>
-            <a:solidFill>
-              <a:srgbClr val="000000"/>
-            </a:solidFill>
-            <a:effectLst/>
-            <a:uFillTx/>
-          </a:defRPr>
-        </a:lvl1pPr>
-        <a:lvl2pPr marL="0" marR="0" indent="0" algn="l" defTabSz="914400" rtl="0" fontAlgn="auto" latinLnBrk="1" hangingPunct="0">
-          <a:lnSpc>
-            <a:spcPct val="100000"/>
-          </a:lnSpc>
-          <a:spcBef>
-            <a:spcPts val="0"/>
-          </a:spcBef>
-          <a:spcAft>
-            <a:spcPts val="0"/>
-          </a:spcAft>
-          <a:buClrTx/>
-          <a:buSzTx/>
-          <a:buFontTx/>
-          <a:buNone/>
-          <a:tabLst/>
-          <a:defRPr b="0" baseline="0" cap="none" i="0" spc="0" strike="noStrike" sz="1800" u="none" kumimoji="0" normalizeH="0">
-            <a:ln>
-              <a:noFill/>
-            </a:ln>
-            <a:solidFill>
-              <a:srgbClr val="000000"/>
-            </a:solidFill>
-            <a:effectLst/>
-            <a:uFillTx/>
-          </a:defRPr>
-        </a:lvl2pPr>
-        <a:lvl3pPr marL="0" marR="0" indent="0" algn="l" defTabSz="914400" rtl="0" fontAlgn="auto" latinLnBrk="1" hangingPunct="0">
-          <a:lnSpc>
-            <a:spcPct val="100000"/>
-          </a:lnSpc>
-          <a:spcBef>
-            <a:spcPts val="0"/>
-          </a:spcBef>
-          <a:spcAft>
-            <a:spcPts val="0"/>
-          </a:spcAft>
-          <a:buClrTx/>
-          <a:buSzTx/>
-          <a:buFontTx/>
-          <a:buNone/>
-          <a:tabLst/>
-          <a:defRPr b="0" baseline="0" cap="none" i="0" spc="0" strike="noStrike" sz="1800" u="none" kumimoji="0" normalizeH="0">
-            <a:ln>
-              <a:noFill/>
-            </a:ln>
-            <a:solidFill>
-              <a:srgbClr val="000000"/>
-            </a:solidFill>
-            <a:effectLst/>
-            <a:uFillTx/>
-          </a:defRPr>
-        </a:lvl3pPr>
-        <a:lvl4pPr marL="0" marR="0" indent="0" algn="l" defTabSz="914400" rtl="0" fontAlgn="auto" latinLnBrk="1" hangingPunct="0">
-          <a:lnSpc>
-            <a:spcPct val="100000"/>
-          </a:lnSpc>
-          <a:spcBef>
-            <a:spcPts val="0"/>
-          </a:spcBef>
-          <a:spcAft>
-            <a:spcPts val="0"/>
-          </a:spcAft>
-          <a:buClrTx/>
-          <a:buSzTx/>
-          <a:buFontTx/>
-          <a:buNone/>
-          <a:tabLst/>
-          <a:defRPr b="0" baseline="0" cap="none" i="0" spc="0" strike="noStrike" sz="1800" u="none" kumimoji="0" normalizeH="0">
-            <a:ln>
-              <a:noFill/>
-            </a:ln>
-            <a:solidFill>
-              <a:srgbClr val="000000"/>
-            </a:solidFill>
-            <a:effectLst/>
-            <a:uFillTx/>
-          </a:defRPr>
-        </a:lvl4pPr>
-        <a:lvl5pPr marL="0" marR="0" indent="0" algn="l" defTabSz="914400" rtl="0" fontAlgn="auto" latinLnBrk="1" hangingPunct="0">
-          <a:lnSpc>
-            <a:spcPct val="100000"/>
-          </a:lnSpc>
-          <a:spcBef>
-            <a:spcPts val="0"/>
-          </a:spcBef>
-          <a:spcAft>
-            <a:spcPts val="0"/>
-          </a:spcAft>
-          <a:buClrTx/>
-          <a:buSzTx/>
-          <a:buFontTx/>
-          <a:buNone/>
-          <a:tabLst/>
-          <a:defRPr b="0" baseline="0" cap="none" i="0" spc="0" strike="noStrike" sz="1800" u="none" kumimoji="0" normalizeH="0">
-            <a:ln>
-              <a:noFill/>
-            </a:ln>
-            <a:solidFill>
-              <a:srgbClr val="000000"/>
-            </a:solidFill>
-            <a:effectLst/>
-            <a:uFillTx/>
-          </a:defRPr>
-        </a:lvl5pPr>
-        <a:lvl6pPr marL="0" marR="0" indent="0" algn="l" defTabSz="914400" rtl="0" fontAlgn="auto" latinLnBrk="1" hangingPunct="0">
-          <a:lnSpc>
-            <a:spcPct val="100000"/>
-          </a:lnSpc>
-          <a:spcBef>
-            <a:spcPts val="0"/>
-          </a:spcBef>
-          <a:spcAft>
-            <a:spcPts val="0"/>
-          </a:spcAft>
-          <a:buClrTx/>
-          <a:buSzTx/>
-          <a:buFontTx/>
-          <a:buNone/>
-          <a:tabLst/>
-          <a:defRPr b="0" baseline="0" cap="none" i="0" spc="0" strike="noStrike" sz="1800" u="none" kumimoji="0" normalizeH="0">
-            <a:ln>
-              <a:noFill/>
-            </a:ln>
-            <a:solidFill>
-              <a:srgbClr val="000000"/>
-            </a:solidFill>
-            <a:effectLst/>
-            <a:uFillTx/>
-          </a:defRPr>
-        </a:lvl6pPr>
-        <a:lvl7pPr marL="0" marR="0" indent="0" algn="l" defTabSz="914400" rtl="0" fontAlgn="auto" latinLnBrk="1" hangingPunct="0">
-          <a:lnSpc>
-            <a:spcPct val="100000"/>
-          </a:lnSpc>
-          <a:spcBef>
-            <a:spcPts val="0"/>
-          </a:spcBef>
-          <a:spcAft>
-            <a:spcPts val="0"/>
-          </a:spcAft>
-          <a:buClrTx/>
-          <a:buSzTx/>
-          <a:buFontTx/>
-          <a:buNone/>
-          <a:tabLst/>
-          <a:defRPr b="0" baseline="0" cap="none" i="0" spc="0" strike="noStrike" sz="1800" u="none" kumimoji="0" normalizeH="0">
-            <a:ln>
-              <a:noFill/>
-            </a:ln>
-            <a:solidFill>
-              <a:srgbClr val="000000"/>
-            </a:solidFill>
-            <a:effectLst/>
-            <a:uFillTx/>
-          </a:defRPr>
-        </a:lvl7pPr>
-        <a:lvl8pPr marL="0" marR="0" indent="0" algn="l" defTabSz="914400" rtl="0" fontAlgn="auto" latinLnBrk="1" hangingPunct="0">
-          <a:lnSpc>
-            <a:spcPct val="100000"/>
-          </a:lnSpc>
-          <a:spcBef>
-            <a:spcPts val="0"/>
-          </a:spcBef>
-          <a:spcAft>
-            <a:spcPts val="0"/>
-          </a:spcAft>
-          <a:buClrTx/>
-          <a:buSzTx/>
-          <a:buFontTx/>
-          <a:buNone/>
-          <a:tabLst/>
-          <a:defRPr b="0" baseline="0" cap="none" i="0" spc="0" strike="noStrike" sz="1800" u="none" kumimoji="0" normalizeH="0">
-            <a:ln>
-              <a:noFill/>
-            </a:ln>
-            <a:solidFill>
-              <a:srgbClr val="000000"/>
-            </a:solidFill>
-            <a:effectLst/>
-            <a:uFillTx/>
-          </a:defRPr>
-        </a:lvl8pPr>
-        <a:lvl9pPr marL="0" marR="0" indent="0" algn="l" defTabSz="914400" rtl="0" fontAlgn="auto" latinLnBrk="1" hangingPunct="0">
-          <a:lnSpc>
-            <a:spcPct val="100000"/>
-          </a:lnSpc>
-          <a:spcBef>
-            <a:spcPts val="0"/>
-          </a:spcBef>
-          <a:spcAft>
-            <a:spcPts val="0"/>
-          </a:spcAft>
-          <a:buClrTx/>
-          <a:buSzTx/>
-          <a:buFontTx/>
-          <a:buNone/>
-          <a:tabLst/>
-          <a:defRPr b="0" baseline="0" cap="none" i="0" spc="0" strike="noStrike" sz="1800" u="none" kumimoji="0" normalizeH="0">
-            <a:ln>
-              <a:noFill/>
-            </a:ln>
-            <a:solidFill>
-              <a:srgbClr val="000000"/>
-            </a:solidFill>
-            <a:effectLst/>
-            <a:uFillTx/>
-          </a:defRPr>
-        </a:lvl9pPr>
-      </a:lstStyle>
-      <a:style>
-        <a:lnRef idx="0"/>
-        <a:fillRef idx="0"/>
-        <a:effectRef idx="0"/>
-        <a:fontRef idx="none"/>
-      </a:style>
-    </a:spDef>
-    <a:lnDef>
-      <a:spPr>
-        <a:noFill/>
-        <a:ln w="25400" cap="flat">
-          <a:solidFill>
-            <a:schemeClr val="accent1"/>
-          </a:solidFill>
-          <a:prstDash val="solid"/>
-          <a:round/>
-        </a:ln>
-        <a:effectLst>
-          <a:outerShdw sx="100000" sy="100000" kx="0" ky="0" algn="b" rotWithShape="0" blurRad="38100" dist="20000" dir="5400000">
-            <a:srgbClr val="000000">
-              <a:alpha val="38000"/>
-            </a:srgbClr>
-          </a:outerShdw>
-        </a:effectLst>
-        <a:sp3d/>
-      </a:spPr>
-      <a:bodyPr rot="0" spcFirstLastPara="1" vertOverflow="overflow" horzOverflow="overflow" vert="horz" wrap="square" lIns="91439" tIns="45719" rIns="91439" bIns="45719" numCol="1" spcCol="38100" rtlCol="0" anchor="t" upright="0">
-        <a:noAutofit/>
-      </a:bodyPr>
-      <a:lstStyle>
-        <a:defPPr marL="0" marR="0" indent="0" algn="l" defTabSz="914400" rtl="0" fontAlgn="auto" latinLnBrk="1" hangingPunct="0">
-          <a:lnSpc>
-            <a:spcPct val="100000"/>
-          </a:lnSpc>
-          <a:spcBef>
-            <a:spcPts val="0"/>
-          </a:spcBef>
-          <a:spcAft>
-            <a:spcPts val="0"/>
-          </a:spcAft>
-          <a:buClrTx/>
-          <a:buSzTx/>
-          <a:buFontTx/>
-          <a:buNone/>
-          <a:tabLst/>
-          <a:defRPr b="0" baseline="0" cap="none" i="0" spc="0" strike="noStrike" sz="1800" u="none" kumimoji="0" normalizeH="0">
-            <a:ln>
-              <a:noFill/>
-            </a:ln>
-            <a:solidFill>
-              <a:srgbClr val="000000"/>
-            </a:solidFill>
-            <a:effectLst/>
-            <a:uFillTx/>
-          </a:defRPr>
-        </a:defPPr>
-        <a:lvl1pPr marL="0" marR="0" indent="0" algn="l" defTabSz="914400" rtl="0" fontAlgn="auto" latinLnBrk="1" hangingPunct="0">
-          <a:lnSpc>
-            <a:spcPct val="100000"/>
-          </a:lnSpc>
-          <a:spcBef>
-            <a:spcPts val="0"/>
-          </a:spcBef>
-          <a:spcAft>
-            <a:spcPts val="0"/>
-          </a:spcAft>
-          <a:buClrTx/>
-          <a:buSzTx/>
-          <a:buFontTx/>
-          <a:buNone/>
-          <a:tabLst/>
-          <a:defRPr b="0" baseline="0" cap="none" i="0" spc="0" strike="noStrike" sz="1800" u="none" kumimoji="0" normalizeH="0">
-            <a:ln>
-              <a:noFill/>
-            </a:ln>
-            <a:solidFill>
-              <a:srgbClr val="000000"/>
-            </a:solidFill>
-            <a:effectLst/>
-            <a:uFillTx/>
-          </a:defRPr>
-        </a:lvl1pPr>
-        <a:lvl2pPr marL="0" marR="0" indent="0" algn="l" defTabSz="914400" rtl="0" fontAlgn="auto" latinLnBrk="1" hangingPunct="0">
-          <a:lnSpc>
-            <a:spcPct val="100000"/>
-          </a:lnSpc>
-          <a:spcBef>
-            <a:spcPts val="0"/>
-          </a:spcBef>
-          <a:spcAft>
-            <a:spcPts val="0"/>
-          </a:spcAft>
-          <a:buClrTx/>
-          <a:buSzTx/>
-          <a:buFontTx/>
-          <a:buNone/>
-          <a:tabLst/>
-          <a:defRPr b="0" baseline="0" cap="none" i="0" spc="0" strike="noStrike" sz="1800" u="none" kumimoji="0" normalizeH="0">
-            <a:ln>
-              <a:noFill/>
-            </a:ln>
-            <a:solidFill>
-              <a:srgbClr val="000000"/>
-            </a:solidFill>
-            <a:effectLst/>
-            <a:uFillTx/>
-          </a:defRPr>
-        </a:lvl2pPr>
-        <a:lvl3pPr marL="0" marR="0" indent="0" algn="l" defTabSz="914400" rtl="0" fontAlgn="auto" latinLnBrk="1" hangingPunct="0">
-          <a:lnSpc>
-            <a:spcPct val="100000"/>
-          </a:lnSpc>
-          <a:spcBef>
-            <a:spcPts val="0"/>
-          </a:spcBef>
-          <a:spcAft>
-            <a:spcPts val="0"/>
-          </a:spcAft>
-          <a:buClrTx/>
-          <a:buSzTx/>
-          <a:buFontTx/>
-          <a:buNone/>
-          <a:tabLst/>
-          <a:defRPr b="0" baseline="0" cap="none" i="0" spc="0" strike="noStrike" sz="1800" u="none" kumimoji="0" normalizeH="0">
-            <a:ln>
-              <a:noFill/>
-            </a:ln>
-            <a:solidFill>
-              <a:srgbClr val="000000"/>
-            </a:solidFill>
-            <a:effectLst/>
-            <a:uFillTx/>
-          </a:defRPr>
-        </a:lvl3pPr>
-        <a:lvl4pPr marL="0" marR="0" indent="0" algn="l" defTabSz="914400" rtl="0" fontAlgn="auto" latinLnBrk="1" hangingPunct="0">
-          <a:lnSpc>
-            <a:spcPct val="100000"/>
-          </a:lnSpc>
-          <a:spcBef>
-            <a:spcPts val="0"/>
-          </a:spcBef>
-          <a:spcAft>
-            <a:spcPts val="0"/>
-          </a:spcAft>
-          <a:buClrTx/>
-          <a:buSzTx/>
-          <a:buFontTx/>
-          <a:buNone/>
-          <a:tabLst/>
-          <a:defRPr b="0" baseline="0" cap="none" i="0" spc="0" strike="noStrike" sz="1800" u="none" kumimoji="0" normalizeH="0">
-            <a:ln>
-              <a:noFill/>
-            </a:ln>
-            <a:solidFill>
-              <a:srgbClr val="000000"/>
-            </a:solidFill>
-            <a:effectLst/>
-            <a:uFillTx/>
-          </a:defRPr>
-        </a:lvl4pPr>
-        <a:lvl5pPr marL="0" marR="0" indent="0" algn="l" defTabSz="914400" rtl="0" fontAlgn="auto" latinLnBrk="1" hangingPunct="0">
-          <a:lnSpc>
-            <a:spcPct val="100000"/>
-          </a:lnSpc>
-          <a:spcBef>
-            <a:spcPts val="0"/>
-          </a:spcBef>
-          <a:spcAft>
-            <a:spcPts val="0"/>
-          </a:spcAft>
-          <a:buClrTx/>
-          <a:buSzTx/>
-          <a:buFontTx/>
-          <a:buNone/>
-          <a:tabLst/>
-          <a:defRPr b="0" baseline="0" cap="none" i="0" spc="0" strike="noStrike" sz="1800" u="none" kumimoji="0" normalizeH="0">
-            <a:ln>
-              <a:noFill/>
-            </a:ln>
-            <a:solidFill>
-              <a:srgbClr val="000000"/>
-            </a:solidFill>
-            <a:effectLst/>
-            <a:uFillTx/>
-          </a:defRPr>
-        </a:lvl5pPr>
-        <a:lvl6pPr marL="0" marR="0" indent="0" algn="l" defTabSz="914400" rtl="0" fontAlgn="auto" latinLnBrk="1" hangingPunct="0">
-          <a:lnSpc>
-            <a:spcPct val="100000"/>
-          </a:lnSpc>
-          <a:spcBef>
-            <a:spcPts val="0"/>
-          </a:spcBef>
-          <a:spcAft>
-            <a:spcPts val="0"/>
-          </a:spcAft>
-          <a:buClrTx/>
-          <a:buSzTx/>
-          <a:buFontTx/>
-          <a:buNone/>
-          <a:tabLst/>
-          <a:defRPr b="0" baseline="0" cap="none" i="0" spc="0" strike="noStrike" sz="1800" u="none" kumimoji="0" normalizeH="0">
-            <a:ln>
-              <a:noFill/>
-            </a:ln>
-            <a:solidFill>
-              <a:srgbClr val="000000"/>
-            </a:solidFill>
-            <a:effectLst/>
-            <a:uFillTx/>
-          </a:defRPr>
-        </a:lvl6pPr>
-        <a:lvl7pPr marL="0" marR="0" indent="0" algn="l" defTabSz="914400" rtl="0" fontAlgn="auto" latinLnBrk="1" hangingPunct="0">
-          <a:lnSpc>
-            <a:spcPct val="100000"/>
-          </a:lnSpc>
-          <a:spcBef>
-            <a:spcPts val="0"/>
-          </a:spcBef>
-          <a:spcAft>
-            <a:spcPts val="0"/>
-          </a:spcAft>
-          <a:buClrTx/>
-          <a:buSzTx/>
-          <a:buFontTx/>
-          <a:buNone/>
-          <a:tabLst/>
-          <a:defRPr b="0" baseline="0" cap="none" i="0" spc="0" strike="noStrike" sz="1800" u="none" kumimoji="0" normalizeH="0">
-            <a:ln>
-              <a:noFill/>
-            </a:ln>
-            <a:solidFill>
-              <a:srgbClr val="000000"/>
-            </a:solidFill>
-            <a:effectLst/>
-            <a:uFillTx/>
-          </a:defRPr>
-        </a:lvl7pPr>
-        <a:lvl8pPr marL="0" marR="0" indent="0" algn="l" defTabSz="914400" rtl="0" fontAlgn="auto" latinLnBrk="1" hangingPunct="0">
-          <a:lnSpc>
-            <a:spcPct val="100000"/>
-          </a:lnSpc>
-          <a:spcBef>
-            <a:spcPts val="0"/>
-          </a:spcBef>
-          <a:spcAft>
-            <a:spcPts val="0"/>
-          </a:spcAft>
-          <a:buClrTx/>
-          <a:buSzTx/>
-          <a:buFontTx/>
-          <a:buNone/>
-          <a:tabLst/>
-          <a:defRPr b="0" baseline="0" cap="none" i="0" spc="0" strike="noStrike" sz="1800" u="none" kumimoji="0" normalizeH="0">
-            <a:ln>
-              <a:noFill/>
-            </a:ln>
-            <a:solidFill>
-              <a:srgbClr val="000000"/>
-            </a:solidFill>
-            <a:effectLst/>
-            <a:uFillTx/>
-          </a:defRPr>
-        </a:lvl8pPr>
-        <a:lvl9pPr marL="0" marR="0" indent="0" algn="l" defTabSz="914400" rtl="0" fontAlgn="auto" latinLnBrk="1" hangingPunct="0">
-          <a:lnSpc>
-            <a:spcPct val="100000"/>
-          </a:lnSpc>
-          <a:spcBef>
-            <a:spcPts val="0"/>
-          </a:spcBef>
-          <a:spcAft>
-            <a:spcPts val="0"/>
-          </a:spcAft>
-          <a:buClrTx/>
-          <a:buSzTx/>
-          <a:buFontTx/>
-          <a:buNone/>
-          <a:tabLst/>
-          <a:defRPr b="0" baseline="0" cap="none" i="0" spc="0" strike="noStrike" sz="1800" u="none" kumimoji="0" normalizeH="0">
-            <a:ln>
-              <a:noFill/>
-            </a:ln>
-            <a:solidFill>
-              <a:srgbClr val="000000"/>
-            </a:solidFill>
-            <a:effectLst/>
-            <a:uFillTx/>
-          </a:defRPr>
-        </a:lvl9pPr>
-      </a:lstStyle>
-      <a:style>
-        <a:lnRef idx="0"/>
-        <a:fillRef idx="0"/>
-        <a:effectRef idx="0"/>
-        <a:fontRef idx="none"/>
-      </a:style>
-    </a:lnDef>
-    <a:txDef>
-      <a:spPr>
-        <a:noFill/>
-        <a:ln w="12700" cap="flat">
-          <a:noFill/>
-          <a:miter lim="400000"/>
-        </a:ln>
-        <a:effectLst/>
-        <a:sp3d/>
-      </a:spPr>
-      <a:bodyPr rot="0" spcFirstLastPara="1" vertOverflow="overflow" horzOverflow="overflow" vert="horz" wrap="square" lIns="45719" tIns="45719" rIns="45719" bIns="45719" numCol="1" spcCol="38100" rtlCol="0" anchor="t" upright="0">
-        <a:spAutoFit/>
-      </a:bodyPr>
-      <a:lstStyle>
-        <a:defPPr marL="0" marR="0" indent="0" algn="l" defTabSz="914400" rtl="0" fontAlgn="auto" latinLnBrk="0" hangingPunct="0">
-          <a:lnSpc>
-            <a:spcPct val="100000"/>
-          </a:lnSpc>
-          <a:spcBef>
-            <a:spcPts val="0"/>
-          </a:spcBef>
-          <a:spcAft>
-            <a:spcPts val="0"/>
-          </a:spcAft>
-          <a:buClrTx/>
-          <a:buSzTx/>
-          <a:buFontTx/>
-          <a:buNone/>
-          <a:tabLst/>
-          <a:defRPr b="0" baseline="0" cap="none" i="0" spc="0" strike="noStrike" sz="1800" u="none" kumimoji="0" normalizeH="0">
-            <a:ln>
-              <a:noFill/>
-            </a:ln>
-            <a:solidFill>
-              <a:srgbClr val="000000"/>
-            </a:solidFill>
-            <a:effectLst/>
-            <a:uFillTx/>
-            <a:latin typeface="Calibri"/>
-            <a:ea typeface="Calibri"/>
-            <a:cs typeface="Calibri"/>
-            <a:sym typeface="Calibri"/>
-          </a:defRPr>
-        </a:defPPr>
-        <a:lvl1pPr marL="0" marR="0" indent="0" algn="l" defTabSz="914400" rtl="0" fontAlgn="auto" latinLnBrk="1" hangingPunct="0">
-          <a:lnSpc>
-            <a:spcPct val="100000"/>
-          </a:lnSpc>
-          <a:spcBef>
-            <a:spcPts val="0"/>
-          </a:spcBef>
-          <a:spcAft>
-            <a:spcPts val="0"/>
-          </a:spcAft>
-          <a:buClrTx/>
-          <a:buSzTx/>
-          <a:buFontTx/>
-          <a:buNone/>
-          <a:tabLst/>
-          <a:defRPr b="0" baseline="0" cap="none" i="0" spc="0" strike="noStrike" sz="1800" u="none" kumimoji="0" normalizeH="0">
-            <a:ln>
-              <a:noFill/>
-            </a:ln>
-            <a:solidFill>
-              <a:srgbClr val="000000"/>
-            </a:solidFill>
-            <a:effectLst/>
-            <a:uFillTx/>
-          </a:defRPr>
-        </a:lvl1pPr>
-        <a:lvl2pPr marL="0" marR="0" indent="0" algn="l" defTabSz="914400" rtl="0" fontAlgn="auto" latinLnBrk="1" hangingPunct="0">
-          <a:lnSpc>
-            <a:spcPct val="100000"/>
-          </a:lnSpc>
-          <a:spcBef>
-            <a:spcPts val="0"/>
-          </a:spcBef>
-          <a:spcAft>
-            <a:spcPts val="0"/>
-          </a:spcAft>
-          <a:buClrTx/>
-          <a:buSzTx/>
-          <a:buFontTx/>
-          <a:buNone/>
-          <a:tabLst/>
-          <a:defRPr b="0" baseline="0" cap="none" i="0" spc="0" strike="noStrike" sz="1800" u="none" kumimoji="0" normalizeH="0">
-            <a:ln>
-              <a:noFill/>
-            </a:ln>
-            <a:solidFill>
-              <a:srgbClr val="000000"/>
-            </a:solidFill>
-            <a:effectLst/>
-            <a:uFillTx/>
-          </a:defRPr>
-        </a:lvl2pPr>
-        <a:lvl3pPr marL="0" marR="0" indent="0" algn="l" defTabSz="914400" rtl="0" fontAlgn="auto" latinLnBrk="1" hangingPunct="0">
-          <a:lnSpc>
-            <a:spcPct val="100000"/>
-          </a:lnSpc>
-          <a:spcBef>
-            <a:spcPts val="0"/>
-          </a:spcBef>
-          <a:spcAft>
-            <a:spcPts val="0"/>
-          </a:spcAft>
-          <a:buClrTx/>
-          <a:buSzTx/>
-          <a:buFontTx/>
-          <a:buNone/>
-          <a:tabLst/>
-          <a:defRPr b="0" baseline="0" cap="none" i="0" spc="0" strike="noStrike" sz="1800" u="none" kumimoji="0" normalizeH="0">
-            <a:ln>
-              <a:noFill/>
-            </a:ln>
-            <a:solidFill>
-              <a:srgbClr val="000000"/>
-            </a:solidFill>
-            <a:effectLst/>
-            <a:uFillTx/>
-          </a:defRPr>
-        </a:lvl3pPr>
-        <a:lvl4pPr marL="0" marR="0" indent="0" algn="l" defTabSz="914400" rtl="0" fontAlgn="auto" latinLnBrk="1" hangingPunct="0">
-          <a:lnSpc>
-            <a:spcPct val="100000"/>
-          </a:lnSpc>
-          <a:spcBef>
-            <a:spcPts val="0"/>
-          </a:spcBef>
-          <a:spcAft>
-            <a:spcPts val="0"/>
-          </a:spcAft>
-          <a:buClrTx/>
-          <a:buSzTx/>
-          <a:buFontTx/>
-          <a:buNone/>
-          <a:tabLst/>
-          <a:defRPr b="0" baseline="0" cap="none" i="0" spc="0" strike="noStrike" sz="1800" u="none" kumimoji="0" normalizeH="0">
-            <a:ln>
-              <a:noFill/>
-            </a:ln>
-            <a:solidFill>
-              <a:srgbClr val="000000"/>
-            </a:solidFill>
-            <a:effectLst/>
-            <a:uFillTx/>
-          </a:defRPr>
-        </a:lvl4pPr>
-        <a:lvl5pPr marL="0" marR="0" indent="0" algn="l" defTabSz="914400" rtl="0" fontAlgn="auto" latinLnBrk="1" hangingPunct="0">
-          <a:lnSpc>
-            <a:spcPct val="100000"/>
-          </a:lnSpc>
-          <a:spcBef>
-            <a:spcPts val="0"/>
-          </a:spcBef>
-          <a:spcAft>
-            <a:spcPts val="0"/>
-          </a:spcAft>
-          <a:buClrTx/>
-          <a:buSzTx/>
-          <a:buFontTx/>
-          <a:buNone/>
-          <a:tabLst/>
-          <a:defRPr b="0" baseline="0" cap="none" i="0" spc="0" strike="noStrike" sz="1800" u="none" kumimoji="0" normalizeH="0">
-            <a:ln>
-              <a:noFill/>
-            </a:ln>
-            <a:solidFill>
-              <a:srgbClr val="000000"/>
-            </a:solidFill>
-            <a:effectLst/>
-            <a:uFillTx/>
-          </a:defRPr>
-        </a:lvl5pPr>
-        <a:lvl6pPr marL="0" marR="0" indent="0" algn="l" defTabSz="914400" rtl="0" fontAlgn="auto" latinLnBrk="1" hangingPunct="0">
-          <a:lnSpc>
-            <a:spcPct val="100000"/>
-          </a:lnSpc>
-          <a:spcBef>
-            <a:spcPts val="0"/>
-          </a:spcBef>
-          <a:spcAft>
-            <a:spcPts val="0"/>
-          </a:spcAft>
-          <a:buClrTx/>
-          <a:buSzTx/>
-          <a:buFontTx/>
-          <a:buNone/>
-          <a:tabLst/>
-          <a:defRPr b="0" baseline="0" cap="none" i="0" spc="0" strike="noStrike" sz="1800" u="none" kumimoji="0" normalizeH="0">
-            <a:ln>
-              <a:noFill/>
-            </a:ln>
-            <a:solidFill>
-              <a:srgbClr val="000000"/>
-            </a:solidFill>
-            <a:effectLst/>
-            <a:uFillTx/>
-          </a:defRPr>
-        </a:lvl6pPr>
-        <a:lvl7pPr marL="0" marR="0" indent="0" algn="l" defTabSz="914400" rtl="0" fontAlgn="auto" latinLnBrk="1" hangingPunct="0">
-          <a:lnSpc>
-            <a:spcPct val="100000"/>
-          </a:lnSpc>
-          <a:spcBef>
-            <a:spcPts val="0"/>
-          </a:spcBef>
-          <a:spcAft>
-            <a:spcPts val="0"/>
-          </a:spcAft>
-          <a:buClrTx/>
-          <a:buSzTx/>
-          <a:buFontTx/>
-          <a:buNone/>
-          <a:tabLst/>
-          <a:defRPr b="0" baseline="0" cap="none" i="0" spc="0" strike="noStrike" sz="1800" u="none" kumimoji="0" normalizeH="0">
-            <a:ln>
-              <a:noFill/>
-            </a:ln>
-            <a:solidFill>
-              <a:srgbClr val="000000"/>
-            </a:solidFill>
-            <a:effectLst/>
-            <a:uFillTx/>
-          </a:defRPr>
-        </a:lvl7pPr>
-        <a:lvl8pPr marL="0" marR="0" indent="0" algn="l" defTabSz="914400" rtl="0" fontAlgn="auto" latinLnBrk="1" hangingPunct="0">
-          <a:lnSpc>
-            <a:spcPct val="100000"/>
-          </a:lnSpc>
-          <a:spcBef>
-            <a:spcPts val="0"/>
-          </a:spcBef>
-          <a:spcAft>
-            <a:spcPts val="0"/>
-          </a:spcAft>
-          <a:buClrTx/>
-          <a:buSzTx/>
-          <a:buFontTx/>
-          <a:buNone/>
-          <a:tabLst/>
-          <a:defRPr b="0" baseline="0" cap="none" i="0" spc="0" strike="noStrike" sz="1800" u="none" kumimoji="0" normalizeH="0">
-            <a:ln>
-              <a:noFill/>
-            </a:ln>
-            <a:solidFill>
-              <a:srgbClr val="000000"/>
-            </a:solidFill>
-            <a:effectLst/>
-            <a:uFillTx/>
-          </a:defRPr>
-        </a:lvl8pPr>
-        <a:lvl9pPr marL="0" marR="0" indent="0" algn="l" defTabSz="914400" rtl="0" fontAlgn="auto" latinLnBrk="1" hangingPunct="0">
-          <a:lnSpc>
-            <a:spcPct val="100000"/>
-          </a:lnSpc>
-          <a:spcBef>
-            <a:spcPts val="0"/>
-          </a:spcBef>
-          <a:spcAft>
-            <a:spcPts val="0"/>
-          </a:spcAft>
-          <a:buClrTx/>
-          <a:buSzTx/>
-          <a:buFontTx/>
-          <a:buNone/>
-          <a:tabLst/>
-          <a:defRPr b="0" baseline="0" cap="none" i="0" spc="0" strike="noStrike" sz="1800" u="none" kumimoji="0" normalizeH="0">
-            <a:ln>
-              <a:noFill/>
-            </a:ln>
-            <a:solidFill>
-              <a:srgbClr val="000000"/>
-            </a:solidFill>
-            <a:effectLst/>
-            <a:uFillTx/>
-          </a:defRPr>
-        </a:lvl9pPr>
-      </a:lstStyle>
-      <a:style>
-        <a:lnRef idx="0"/>
-        <a:fillRef idx="0"/>
-        <a:effectRef idx="0"/>
-        <a:fontRef idx="none"/>
-      </a:style>
-    </a:txDef>
-  </a:objectDefaults>
 </a:theme>
 </file>
</xml_diff>